<commit_message>
Add files via upload (#21)
</commit_message>
<xml_diff>
--- a/.claude/skills/sbsi-template-router/templates/brd/BRD_Template.docx
+++ b/.claude/skills/sbsi-template-router/templates/brd/BRD_Template.docx
@@ -100,18 +100,39 @@
       </w:r>
     </w:p>
     <w:p>
+      <w:pPr>
+        <w:rPr>
+          <w:lang w:val="en-US"/>
+        </w:rPr>
+      </w:pPr>
       <w:r>
         <w:br w:type="page"/>
       </w:r>
     </w:p>
     <w:p>
       <w:pPr>
+        <w:rPr>
+          <w:lang w:val="en-US"/>
+        </w:rPr>
+      </w:pPr>
+      <w:r>
+        <w:rPr>
+          <w:lang w:val="en-US"/>
+        </w:rPr>
+        <w:lastRenderedPageBreak/>
+        <w:br w:type="page"/>
+      </w:r>
+    </w:p>
+    <w:p>
+      <w:pPr>
         <w:pStyle w:val="heading10"/>
       </w:pPr>
+      <w:bookmarkStart w:id="0" w:name="_Toc237935596"/>
       <w:r>
         <w:lastRenderedPageBreak/>
         <w:t>Hướng dẫn sử dụng biểu mẫu</w:t>
       </w:r>
+      <w:bookmarkEnd w:id="0"/>
     </w:p>
     <w:p>
       <w:pPr>
@@ -199,18 +220,22 @@
       <w:pPr>
         <w:pStyle w:val="heading10"/>
       </w:pPr>
+      <w:bookmarkStart w:id="1" w:name="_Toc237935597"/>
       <w:r>
         <w:lastRenderedPageBreak/>
         <w:t>Thông tin &amp; kiểm soát tài liệu</w:t>
       </w:r>
+      <w:bookmarkEnd w:id="1"/>
     </w:p>
     <w:p>
       <w:pPr>
         <w:pStyle w:val="heading20"/>
       </w:pPr>
+      <w:bookmarkStart w:id="2" w:name="_Toc237935598"/>
       <w:r>
         <w:t>Thông tin chung</w:t>
       </w:r>
+      <w:bookmarkEnd w:id="2"/>
     </w:p>
     <w:tbl>
       <w:tblPr>
@@ -234,12 +259,6 @@
         <w:gridCol w:w="6740"/>
       </w:tblGrid>
       <w:tr>
-        <w:tblPrEx>
-          <w:tblCellMar>
-            <w:top w:w="0" w:type="dxa"/>
-            <w:bottom w:w="0" w:type="dxa"/>
-          </w:tblCellMar>
-        </w:tblPrEx>
         <w:trPr>
           <w:tblHeader/>
         </w:trPr>
@@ -301,12 +320,6 @@
         </w:tc>
       </w:tr>
       <w:tr>
-        <w:tblPrEx>
-          <w:tblCellMar>
-            <w:top w:w="0" w:type="dxa"/>
-            <w:bottom w:w="0" w:type="dxa"/>
-          </w:tblCellMar>
-        </w:tblPrEx>
         <w:tc>
           <w:tcPr>
             <w:tcW w:w="2600" w:type="dxa"/>
@@ -358,12 +371,6 @@
         </w:tc>
       </w:tr>
       <w:tr>
-        <w:tblPrEx>
-          <w:tblCellMar>
-            <w:top w:w="0" w:type="dxa"/>
-            <w:bottom w:w="0" w:type="dxa"/>
-          </w:tblCellMar>
-        </w:tblPrEx>
         <w:tc>
           <w:tcPr>
             <w:tcW w:w="2600" w:type="dxa"/>
@@ -415,12 +422,6 @@
         </w:tc>
       </w:tr>
       <w:tr>
-        <w:tblPrEx>
-          <w:tblCellMar>
-            <w:top w:w="0" w:type="dxa"/>
-            <w:bottom w:w="0" w:type="dxa"/>
-          </w:tblCellMar>
-        </w:tblPrEx>
         <w:tc>
           <w:tcPr>
             <w:tcW w:w="2600" w:type="dxa"/>
@@ -471,12 +472,6 @@
         </w:tc>
       </w:tr>
       <w:tr>
-        <w:tblPrEx>
-          <w:tblCellMar>
-            <w:top w:w="0" w:type="dxa"/>
-            <w:bottom w:w="0" w:type="dxa"/>
-          </w:tblCellMar>
-        </w:tblPrEx>
         <w:tc>
           <w:tcPr>
             <w:tcW w:w="2600" w:type="dxa"/>
@@ -527,12 +522,6 @@
         </w:tc>
       </w:tr>
       <w:tr>
-        <w:tblPrEx>
-          <w:tblCellMar>
-            <w:top w:w="0" w:type="dxa"/>
-            <w:bottom w:w="0" w:type="dxa"/>
-          </w:tblCellMar>
-        </w:tblPrEx>
         <w:tc>
           <w:tcPr>
             <w:tcW w:w="2600" w:type="dxa"/>
@@ -584,12 +573,6 @@
         </w:tc>
       </w:tr>
       <w:tr>
-        <w:tblPrEx>
-          <w:tblCellMar>
-            <w:top w:w="0" w:type="dxa"/>
-            <w:bottom w:w="0" w:type="dxa"/>
-          </w:tblCellMar>
-        </w:tblPrEx>
         <w:tc>
           <w:tcPr>
             <w:tcW w:w="2600" w:type="dxa"/>
@@ -650,9 +633,11 @@
       <w:pPr>
         <w:pStyle w:val="heading20"/>
       </w:pPr>
+      <w:bookmarkStart w:id="3" w:name="_Toc237935599"/>
       <w:r>
         <w:t>Lịch sử phiên bản</w:t>
       </w:r>
+      <w:bookmarkEnd w:id="3"/>
     </w:p>
     <w:tbl>
       <w:tblPr>
@@ -678,12 +663,6 @@
         <w:gridCol w:w="3846"/>
       </w:tblGrid>
       <w:tr>
-        <w:tblPrEx>
-          <w:tblCellMar>
-            <w:top w:w="0" w:type="dxa"/>
-            <w:bottom w:w="0" w:type="dxa"/>
-          </w:tblCellMar>
-        </w:tblPrEx>
         <w:trPr>
           <w:tblHeader/>
         </w:trPr>
@@ -801,12 +780,6 @@
         </w:tc>
       </w:tr>
       <w:tr>
-        <w:tblPrEx>
-          <w:tblCellMar>
-            <w:top w:w="0" w:type="dxa"/>
-            <w:bottom w:w="0" w:type="dxa"/>
-          </w:tblCellMar>
-        </w:tblPrEx>
         <w:tc>
           <w:tcPr>
             <w:tcW w:w="1400" w:type="dxa"/>
@@ -888,12 +861,6 @@
         </w:tc>
       </w:tr>
       <w:tr>
-        <w:tblPrEx>
-          <w:tblCellMar>
-            <w:top w:w="0" w:type="dxa"/>
-            <w:bottom w:w="0" w:type="dxa"/>
-          </w:tblCellMar>
-        </w:tblPrEx>
         <w:tc>
           <w:tcPr>
             <w:tcW w:w="1400" w:type="dxa"/>
@@ -960,12 +927,6 @@
         </w:tc>
       </w:tr>
       <w:tr>
-        <w:tblPrEx>
-          <w:tblCellMar>
-            <w:top w:w="0" w:type="dxa"/>
-            <w:bottom w:w="0" w:type="dxa"/>
-          </w:tblCellMar>
-        </w:tblPrEx>
         <w:tc>
           <w:tcPr>
             <w:tcW w:w="1400" w:type="dxa"/>
@@ -1041,9 +1002,11 @@
       <w:pPr>
         <w:pStyle w:val="heading20"/>
       </w:pPr>
+      <w:bookmarkStart w:id="4" w:name="_Toc237935600"/>
       <w:r>
         <w:t>Phê duyệt</w:t>
       </w:r>
+      <w:bookmarkEnd w:id="4"/>
     </w:p>
     <w:tbl>
       <w:tblPr>
@@ -1069,12 +1032,6 @@
         <w:gridCol w:w="2246"/>
       </w:tblGrid>
       <w:tr>
-        <w:tblPrEx>
-          <w:tblCellMar>
-            <w:top w:w="0" w:type="dxa"/>
-            <w:bottom w:w="0" w:type="dxa"/>
-          </w:tblCellMar>
-        </w:tblPrEx>
         <w:trPr>
           <w:tblHeader/>
         </w:trPr>
@@ -1192,12 +1149,6 @@
         </w:tc>
       </w:tr>
       <w:tr>
-        <w:tblPrEx>
-          <w:tblCellMar>
-            <w:top w:w="0" w:type="dxa"/>
-            <w:bottom w:w="0" w:type="dxa"/>
-          </w:tblCellMar>
-        </w:tblPrEx>
         <w:tc>
           <w:tcPr>
             <w:tcW w:w="2200" w:type="dxa"/>
@@ -1279,12 +1230,6 @@
         </w:tc>
       </w:tr>
       <w:tr>
-        <w:tblPrEx>
-          <w:tblCellMar>
-            <w:top w:w="0" w:type="dxa"/>
-            <w:bottom w:w="0" w:type="dxa"/>
-          </w:tblCellMar>
-        </w:tblPrEx>
         <w:tc>
           <w:tcPr>
             <w:tcW w:w="2200" w:type="dxa"/>
@@ -1367,12 +1312,6 @@
         </w:tc>
       </w:tr>
       <w:tr>
-        <w:tblPrEx>
-          <w:tblCellMar>
-            <w:top w:w="0" w:type="dxa"/>
-            <w:bottom w:w="0" w:type="dxa"/>
-          </w:tblCellMar>
-        </w:tblPrEx>
         <w:tc>
           <w:tcPr>
             <w:tcW w:w="2200" w:type="dxa"/>
@@ -1464,36 +1403,2858 @@
       <w:pPr>
         <w:pStyle w:val="heading20"/>
       </w:pPr>
+      <w:bookmarkStart w:id="5" w:name="_Toc237935601"/>
       <w:r>
         <w:lastRenderedPageBreak/>
         <w:t>Mục lục</w:t>
       </w:r>
+      <w:bookmarkEnd w:id="5"/>
     </w:p>
     <w:sdt>
       <w:sdtPr>
         <w:alias w:val="Mục lục"/>
         <w:id w:val="210124681"/>
       </w:sdtPr>
+      <w:sdtEndPr>
+        <w:rPr>
+          <w:rFonts w:ascii="Times New Roman" w:eastAsia="Times New Roman" w:hAnsi="Times New Roman"/>
+          <w:color w:val="000000"/>
+          <w:sz w:val="24"/>
+          <w:szCs w:val="24"/>
+          <w:lang w:val="vi-VN" w:eastAsia="vi-VN"/>
+        </w:rPr>
+      </w:sdtEndPr>
       <w:sdtContent>
         <w:p>
+          <w:pPr>
+            <w:pStyle w:val="TOC1"/>
+            <w:tabs>
+              <w:tab w:val="left" w:pos="440"/>
+              <w:tab w:val="right" w:leader="dot" w:pos="9350"/>
+            </w:tabs>
+            <w:rPr>
+              <w:rFonts w:cstheme="minorBidi"/>
+              <w:noProof/>
+              <w:kern w:val="2"/>
+              <w:sz w:val="24"/>
+              <w:szCs w:val="24"/>
+              <w:lang w:val="vi-VN" w:eastAsia="vi-VN"/>
+              <w14:ligatures w14:val="standardContextual"/>
+            </w:rPr>
+          </w:pPr>
           <w:r>
             <w:fldChar w:fldCharType="begin"/>
           </w:r>
           <w:r>
-            <w:instrText>TOC \h \o "1-2"</w:instrText>
+            <w:instrText xml:space="preserve"> TOC \o "3-3" \h \z \t "heading 10,1,heading 20,2" </w:instrText>
           </w:r>
           <w:r>
             <w:fldChar w:fldCharType="separate"/>
           </w:r>
-          <w:r>
+          <w:hyperlink w:anchor="_Toc237935596" w:history="1">
+            <w:r>
+              <w:rPr>
+                <w:rStyle w:val="Hyperlink"/>
+                <w:noProof/>
+              </w:rPr>
+              <w:t>1.</w:t>
+            </w:r>
+            <w:r>
+              <w:rPr>
+                <w:rFonts w:cstheme="minorBidi"/>
+                <w:noProof/>
+                <w:kern w:val="2"/>
+                <w:sz w:val="24"/>
+                <w:szCs w:val="24"/>
+                <w:lang w:val="vi-VN" w:eastAsia="vi-VN"/>
+                <w14:ligatures w14:val="standardContextual"/>
+              </w:rPr>
+              <w:tab/>
+            </w:r>
+            <w:r>
+              <w:rPr>
+                <w:rStyle w:val="Hyperlink"/>
+                <w:noProof/>
+              </w:rPr>
+              <w:t>Hướng dẫn sử dụng biểu mẫu</w:t>
+            </w:r>
+            <w:r>
+              <w:rPr>
+                <w:noProof/>
+                <w:webHidden/>
+              </w:rPr>
+              <w:tab/>
+            </w:r>
+            <w:r>
+              <w:rPr>
+                <w:noProof/>
+                <w:webHidden/>
+              </w:rPr>
+              <w:fldChar w:fldCharType="begin"/>
+            </w:r>
+            <w:r>
+              <w:rPr>
+                <w:noProof/>
+                <w:webHidden/>
+              </w:rPr>
+              <w:instrText xml:space="preserve"> PAGEREF _Toc237935596 \h </w:instrText>
+            </w:r>
+            <w:r>
+              <w:rPr>
+                <w:noProof/>
+                <w:webHidden/>
+              </w:rPr>
+            </w:r>
+            <w:r>
+              <w:rPr>
+                <w:noProof/>
+                <w:webHidden/>
+              </w:rPr>
+              <w:fldChar w:fldCharType="separate"/>
+            </w:r>
+            <w:r>
+              <w:rPr>
+                <w:noProof/>
+                <w:webHidden/>
+              </w:rPr>
+              <w:t>3</w:t>
+            </w:r>
+            <w:r>
+              <w:rPr>
+                <w:noProof/>
+                <w:webHidden/>
+              </w:rPr>
+              <w:fldChar w:fldCharType="end"/>
+            </w:r>
+          </w:hyperlink>
+        </w:p>
+        <w:p>
+          <w:pPr>
+            <w:pStyle w:val="TOC1"/>
+            <w:tabs>
+              <w:tab w:val="left" w:pos="440"/>
+              <w:tab w:val="right" w:leader="dot" w:pos="9350"/>
+            </w:tabs>
             <w:rPr>
-              <w:b/>
-              <w:bCs/>
+              <w:rFonts w:cstheme="minorBidi"/>
               <w:noProof/>
-              <w:lang w:val="en-US"/>
+              <w:kern w:val="2"/>
+              <w:sz w:val="24"/>
+              <w:szCs w:val="24"/>
+              <w:lang w:val="vi-VN" w:eastAsia="vi-VN"/>
+              <w14:ligatures w14:val="standardContextual"/>
             </w:rPr>
-            <w:t>No table of contents entries found.</w:t>
-          </w:r>
+          </w:pPr>
+          <w:hyperlink w:anchor="_Toc237935597" w:history="1">
+            <w:r>
+              <w:rPr>
+                <w:rStyle w:val="Hyperlink"/>
+                <w:noProof/>
+              </w:rPr>
+              <w:t>2.</w:t>
+            </w:r>
+            <w:r>
+              <w:rPr>
+                <w:rFonts w:cstheme="minorBidi"/>
+                <w:noProof/>
+                <w:kern w:val="2"/>
+                <w:sz w:val="24"/>
+                <w:szCs w:val="24"/>
+                <w:lang w:val="vi-VN" w:eastAsia="vi-VN"/>
+                <w14:ligatures w14:val="standardContextual"/>
+              </w:rPr>
+              <w:tab/>
+            </w:r>
+            <w:r>
+              <w:rPr>
+                <w:rStyle w:val="Hyperlink"/>
+                <w:noProof/>
+              </w:rPr>
+              <w:t>Thông tin &amp; kiểm soát tài liệu</w:t>
+            </w:r>
+            <w:r>
+              <w:rPr>
+                <w:noProof/>
+                <w:webHidden/>
+              </w:rPr>
+              <w:tab/>
+            </w:r>
+            <w:r>
+              <w:rPr>
+                <w:noProof/>
+                <w:webHidden/>
+              </w:rPr>
+              <w:fldChar w:fldCharType="begin"/>
+            </w:r>
+            <w:r>
+              <w:rPr>
+                <w:noProof/>
+                <w:webHidden/>
+              </w:rPr>
+              <w:instrText xml:space="preserve"> PAGEREF _Toc237935597 \h </w:instrText>
+            </w:r>
+            <w:r>
+              <w:rPr>
+                <w:noProof/>
+                <w:webHidden/>
+              </w:rPr>
+            </w:r>
+            <w:r>
+              <w:rPr>
+                <w:noProof/>
+                <w:webHidden/>
+              </w:rPr>
+              <w:fldChar w:fldCharType="separate"/>
+            </w:r>
+            <w:r>
+              <w:rPr>
+                <w:noProof/>
+                <w:webHidden/>
+              </w:rPr>
+              <w:t>4</w:t>
+            </w:r>
+            <w:r>
+              <w:rPr>
+                <w:noProof/>
+                <w:webHidden/>
+              </w:rPr>
+              <w:fldChar w:fldCharType="end"/>
+            </w:r>
+          </w:hyperlink>
+        </w:p>
+        <w:p>
+          <w:pPr>
+            <w:pStyle w:val="TOC2"/>
+            <w:tabs>
+              <w:tab w:val="left" w:pos="960"/>
+              <w:tab w:val="right" w:leader="dot" w:pos="9350"/>
+            </w:tabs>
+            <w:rPr>
+              <w:rFonts w:cstheme="minorBidi"/>
+              <w:noProof/>
+              <w:kern w:val="2"/>
+              <w:sz w:val="24"/>
+              <w:szCs w:val="24"/>
+              <w:lang w:val="vi-VN" w:eastAsia="vi-VN"/>
+              <w14:ligatures w14:val="standardContextual"/>
+            </w:rPr>
+          </w:pPr>
+          <w:hyperlink w:anchor="_Toc237935598" w:history="1">
+            <w:r>
+              <w:rPr>
+                <w:rStyle w:val="Hyperlink"/>
+                <w:noProof/>
+              </w:rPr>
+              <w:t>2.1.</w:t>
+            </w:r>
+            <w:r>
+              <w:rPr>
+                <w:rFonts w:cstheme="minorBidi"/>
+                <w:noProof/>
+                <w:kern w:val="2"/>
+                <w:sz w:val="24"/>
+                <w:szCs w:val="24"/>
+                <w:lang w:val="vi-VN" w:eastAsia="vi-VN"/>
+                <w14:ligatures w14:val="standardContextual"/>
+              </w:rPr>
+              <w:tab/>
+            </w:r>
+            <w:r>
+              <w:rPr>
+                <w:rStyle w:val="Hyperlink"/>
+                <w:noProof/>
+              </w:rPr>
+              <w:t>Thông tin chung</w:t>
+            </w:r>
+            <w:r>
+              <w:rPr>
+                <w:noProof/>
+                <w:webHidden/>
+              </w:rPr>
+              <w:tab/>
+            </w:r>
+            <w:r>
+              <w:rPr>
+                <w:noProof/>
+                <w:webHidden/>
+              </w:rPr>
+              <w:fldChar w:fldCharType="begin"/>
+            </w:r>
+            <w:r>
+              <w:rPr>
+                <w:noProof/>
+                <w:webHidden/>
+              </w:rPr>
+              <w:instrText xml:space="preserve"> PAGEREF _Toc237935598 \h </w:instrText>
+            </w:r>
+            <w:r>
+              <w:rPr>
+                <w:noProof/>
+                <w:webHidden/>
+              </w:rPr>
+            </w:r>
+            <w:r>
+              <w:rPr>
+                <w:noProof/>
+                <w:webHidden/>
+              </w:rPr>
+              <w:fldChar w:fldCharType="separate"/>
+            </w:r>
+            <w:r>
+              <w:rPr>
+                <w:noProof/>
+                <w:webHidden/>
+              </w:rPr>
+              <w:t>4</w:t>
+            </w:r>
+            <w:r>
+              <w:rPr>
+                <w:noProof/>
+                <w:webHidden/>
+              </w:rPr>
+              <w:fldChar w:fldCharType="end"/>
+            </w:r>
+          </w:hyperlink>
+        </w:p>
+        <w:p>
+          <w:pPr>
+            <w:pStyle w:val="TOC2"/>
+            <w:tabs>
+              <w:tab w:val="left" w:pos="960"/>
+              <w:tab w:val="right" w:leader="dot" w:pos="9350"/>
+            </w:tabs>
+            <w:rPr>
+              <w:rFonts w:cstheme="minorBidi"/>
+              <w:noProof/>
+              <w:kern w:val="2"/>
+              <w:sz w:val="24"/>
+              <w:szCs w:val="24"/>
+              <w:lang w:val="vi-VN" w:eastAsia="vi-VN"/>
+              <w14:ligatures w14:val="standardContextual"/>
+            </w:rPr>
+          </w:pPr>
+          <w:hyperlink w:anchor="_Toc237935599" w:history="1">
+            <w:r>
+              <w:rPr>
+                <w:rStyle w:val="Hyperlink"/>
+                <w:noProof/>
+              </w:rPr>
+              <w:t>2.2.</w:t>
+            </w:r>
+            <w:r>
+              <w:rPr>
+                <w:rFonts w:cstheme="minorBidi"/>
+                <w:noProof/>
+                <w:kern w:val="2"/>
+                <w:sz w:val="24"/>
+                <w:szCs w:val="24"/>
+                <w:lang w:val="vi-VN" w:eastAsia="vi-VN"/>
+                <w14:ligatures w14:val="standardContextual"/>
+              </w:rPr>
+              <w:tab/>
+            </w:r>
+            <w:r>
+              <w:rPr>
+                <w:rStyle w:val="Hyperlink"/>
+                <w:noProof/>
+              </w:rPr>
+              <w:t>Lịch sử phiên bản</w:t>
+            </w:r>
+            <w:r>
+              <w:rPr>
+                <w:noProof/>
+                <w:webHidden/>
+              </w:rPr>
+              <w:tab/>
+            </w:r>
+            <w:r>
+              <w:rPr>
+                <w:noProof/>
+                <w:webHidden/>
+              </w:rPr>
+              <w:fldChar w:fldCharType="begin"/>
+            </w:r>
+            <w:r>
+              <w:rPr>
+                <w:noProof/>
+                <w:webHidden/>
+              </w:rPr>
+              <w:instrText xml:space="preserve"> PAGEREF _Toc237935599 \h </w:instrText>
+            </w:r>
+            <w:r>
+              <w:rPr>
+                <w:noProof/>
+                <w:webHidden/>
+              </w:rPr>
+            </w:r>
+            <w:r>
+              <w:rPr>
+                <w:noProof/>
+                <w:webHidden/>
+              </w:rPr>
+              <w:fldChar w:fldCharType="separate"/>
+            </w:r>
+            <w:r>
+              <w:rPr>
+                <w:noProof/>
+                <w:webHidden/>
+              </w:rPr>
+              <w:t>4</w:t>
+            </w:r>
+            <w:r>
+              <w:rPr>
+                <w:noProof/>
+                <w:webHidden/>
+              </w:rPr>
+              <w:fldChar w:fldCharType="end"/>
+            </w:r>
+          </w:hyperlink>
+        </w:p>
+        <w:p>
+          <w:pPr>
+            <w:pStyle w:val="TOC2"/>
+            <w:tabs>
+              <w:tab w:val="left" w:pos="960"/>
+              <w:tab w:val="right" w:leader="dot" w:pos="9350"/>
+            </w:tabs>
+            <w:rPr>
+              <w:rFonts w:cstheme="minorBidi"/>
+              <w:noProof/>
+              <w:kern w:val="2"/>
+              <w:sz w:val="24"/>
+              <w:szCs w:val="24"/>
+              <w:lang w:val="vi-VN" w:eastAsia="vi-VN"/>
+              <w14:ligatures w14:val="standardContextual"/>
+            </w:rPr>
+          </w:pPr>
+          <w:hyperlink w:anchor="_Toc237935600" w:history="1">
+            <w:r>
+              <w:rPr>
+                <w:rStyle w:val="Hyperlink"/>
+                <w:noProof/>
+              </w:rPr>
+              <w:t>2.3.</w:t>
+            </w:r>
+            <w:r>
+              <w:rPr>
+                <w:rFonts w:cstheme="minorBidi"/>
+                <w:noProof/>
+                <w:kern w:val="2"/>
+                <w:sz w:val="24"/>
+                <w:szCs w:val="24"/>
+                <w:lang w:val="vi-VN" w:eastAsia="vi-VN"/>
+                <w14:ligatures w14:val="standardContextual"/>
+              </w:rPr>
+              <w:tab/>
+            </w:r>
+            <w:r>
+              <w:rPr>
+                <w:rStyle w:val="Hyperlink"/>
+                <w:noProof/>
+              </w:rPr>
+              <w:t>Phê duyệt</w:t>
+            </w:r>
+            <w:r>
+              <w:rPr>
+                <w:noProof/>
+                <w:webHidden/>
+              </w:rPr>
+              <w:tab/>
+            </w:r>
+            <w:r>
+              <w:rPr>
+                <w:noProof/>
+                <w:webHidden/>
+              </w:rPr>
+              <w:fldChar w:fldCharType="begin"/>
+            </w:r>
+            <w:r>
+              <w:rPr>
+                <w:noProof/>
+                <w:webHidden/>
+              </w:rPr>
+              <w:instrText xml:space="preserve"> PAGEREF _Toc237935600 \h </w:instrText>
+            </w:r>
+            <w:r>
+              <w:rPr>
+                <w:noProof/>
+                <w:webHidden/>
+              </w:rPr>
+            </w:r>
+            <w:r>
+              <w:rPr>
+                <w:noProof/>
+                <w:webHidden/>
+              </w:rPr>
+              <w:fldChar w:fldCharType="separate"/>
+            </w:r>
+            <w:r>
+              <w:rPr>
+                <w:noProof/>
+                <w:webHidden/>
+              </w:rPr>
+              <w:t>4</w:t>
+            </w:r>
+            <w:r>
+              <w:rPr>
+                <w:noProof/>
+                <w:webHidden/>
+              </w:rPr>
+              <w:fldChar w:fldCharType="end"/>
+            </w:r>
+          </w:hyperlink>
+        </w:p>
+        <w:p>
+          <w:pPr>
+            <w:pStyle w:val="TOC2"/>
+            <w:tabs>
+              <w:tab w:val="left" w:pos="960"/>
+              <w:tab w:val="right" w:leader="dot" w:pos="9350"/>
+            </w:tabs>
+            <w:rPr>
+              <w:rFonts w:cstheme="minorBidi"/>
+              <w:noProof/>
+              <w:kern w:val="2"/>
+              <w:sz w:val="24"/>
+              <w:szCs w:val="24"/>
+              <w:lang w:val="vi-VN" w:eastAsia="vi-VN"/>
+              <w14:ligatures w14:val="standardContextual"/>
+            </w:rPr>
+          </w:pPr>
+          <w:hyperlink w:anchor="_Toc237935601" w:history="1">
+            <w:r>
+              <w:rPr>
+                <w:rStyle w:val="Hyperlink"/>
+                <w:noProof/>
+              </w:rPr>
+              <w:t>2.4.</w:t>
+            </w:r>
+            <w:r>
+              <w:rPr>
+                <w:rFonts w:cstheme="minorBidi"/>
+                <w:noProof/>
+                <w:kern w:val="2"/>
+                <w:sz w:val="24"/>
+                <w:szCs w:val="24"/>
+                <w:lang w:val="vi-VN" w:eastAsia="vi-VN"/>
+                <w14:ligatures w14:val="standardContextual"/>
+              </w:rPr>
+              <w:tab/>
+            </w:r>
+            <w:r>
+              <w:rPr>
+                <w:rStyle w:val="Hyperlink"/>
+                <w:noProof/>
+              </w:rPr>
+              <w:t>Mục lục</w:t>
+            </w:r>
+            <w:r>
+              <w:rPr>
+                <w:noProof/>
+                <w:webHidden/>
+              </w:rPr>
+              <w:tab/>
+            </w:r>
+            <w:r>
+              <w:rPr>
+                <w:noProof/>
+                <w:webHidden/>
+              </w:rPr>
+              <w:fldChar w:fldCharType="begin"/>
+            </w:r>
+            <w:r>
+              <w:rPr>
+                <w:noProof/>
+                <w:webHidden/>
+              </w:rPr>
+              <w:instrText xml:space="preserve"> PAGEREF _Toc237935601 \h </w:instrText>
+            </w:r>
+            <w:r>
+              <w:rPr>
+                <w:noProof/>
+                <w:webHidden/>
+              </w:rPr>
+            </w:r>
+            <w:r>
+              <w:rPr>
+                <w:noProof/>
+                <w:webHidden/>
+              </w:rPr>
+              <w:fldChar w:fldCharType="separate"/>
+            </w:r>
+            <w:r>
+              <w:rPr>
+                <w:noProof/>
+                <w:webHidden/>
+              </w:rPr>
+              <w:t>5</w:t>
+            </w:r>
+            <w:r>
+              <w:rPr>
+                <w:noProof/>
+                <w:webHidden/>
+              </w:rPr>
+              <w:fldChar w:fldCharType="end"/>
+            </w:r>
+          </w:hyperlink>
+        </w:p>
+        <w:p>
+          <w:pPr>
+            <w:pStyle w:val="TOC1"/>
+            <w:tabs>
+              <w:tab w:val="left" w:pos="440"/>
+              <w:tab w:val="right" w:leader="dot" w:pos="9350"/>
+            </w:tabs>
+            <w:rPr>
+              <w:rFonts w:cstheme="minorBidi"/>
+              <w:noProof/>
+              <w:kern w:val="2"/>
+              <w:sz w:val="24"/>
+              <w:szCs w:val="24"/>
+              <w:lang w:val="vi-VN" w:eastAsia="vi-VN"/>
+              <w14:ligatures w14:val="standardContextual"/>
+            </w:rPr>
+          </w:pPr>
+          <w:hyperlink w:anchor="_Toc237935602" w:history="1">
+            <w:r>
+              <w:rPr>
+                <w:rStyle w:val="Hyperlink"/>
+                <w:noProof/>
+              </w:rPr>
+              <w:t>3.</w:t>
+            </w:r>
+            <w:r>
+              <w:rPr>
+                <w:rFonts w:cstheme="minorBidi"/>
+                <w:noProof/>
+                <w:kern w:val="2"/>
+                <w:sz w:val="24"/>
+                <w:szCs w:val="24"/>
+                <w:lang w:val="vi-VN" w:eastAsia="vi-VN"/>
+                <w14:ligatures w14:val="standardContextual"/>
+              </w:rPr>
+              <w:tab/>
+            </w:r>
+            <w:r>
+              <w:rPr>
+                <w:rStyle w:val="Hyperlink"/>
+                <w:noProof/>
+              </w:rPr>
+              <w:t>Giới thiệu &amp; bối cảnh</w:t>
+            </w:r>
+            <w:r>
+              <w:rPr>
+                <w:noProof/>
+                <w:webHidden/>
+              </w:rPr>
+              <w:tab/>
+            </w:r>
+            <w:r>
+              <w:rPr>
+                <w:noProof/>
+                <w:webHidden/>
+              </w:rPr>
+              <w:fldChar w:fldCharType="begin"/>
+            </w:r>
+            <w:r>
+              <w:rPr>
+                <w:noProof/>
+                <w:webHidden/>
+              </w:rPr>
+              <w:instrText xml:space="preserve"> PAGEREF _Toc237935602 \h </w:instrText>
+            </w:r>
+            <w:r>
+              <w:rPr>
+                <w:noProof/>
+                <w:webHidden/>
+              </w:rPr>
+            </w:r>
+            <w:r>
+              <w:rPr>
+                <w:noProof/>
+                <w:webHidden/>
+              </w:rPr>
+              <w:fldChar w:fldCharType="separate"/>
+            </w:r>
+            <w:r>
+              <w:rPr>
+                <w:noProof/>
+                <w:webHidden/>
+              </w:rPr>
+              <w:t>6</w:t>
+            </w:r>
+            <w:r>
+              <w:rPr>
+                <w:noProof/>
+                <w:webHidden/>
+              </w:rPr>
+              <w:fldChar w:fldCharType="end"/>
+            </w:r>
+          </w:hyperlink>
+        </w:p>
+        <w:p>
+          <w:pPr>
+            <w:pStyle w:val="TOC2"/>
+            <w:tabs>
+              <w:tab w:val="left" w:pos="960"/>
+              <w:tab w:val="right" w:leader="dot" w:pos="9350"/>
+            </w:tabs>
+            <w:rPr>
+              <w:rFonts w:cstheme="minorBidi"/>
+              <w:noProof/>
+              <w:kern w:val="2"/>
+              <w:sz w:val="24"/>
+              <w:szCs w:val="24"/>
+              <w:lang w:val="vi-VN" w:eastAsia="vi-VN"/>
+              <w14:ligatures w14:val="standardContextual"/>
+            </w:rPr>
+          </w:pPr>
+          <w:hyperlink w:anchor="_Toc237935603" w:history="1">
+            <w:r>
+              <w:rPr>
+                <w:rStyle w:val="Hyperlink"/>
+                <w:noProof/>
+              </w:rPr>
+              <w:t>3.1.</w:t>
+            </w:r>
+            <w:r>
+              <w:rPr>
+                <w:rFonts w:cstheme="minorBidi"/>
+                <w:noProof/>
+                <w:kern w:val="2"/>
+                <w:sz w:val="24"/>
+                <w:szCs w:val="24"/>
+                <w:lang w:val="vi-VN" w:eastAsia="vi-VN"/>
+                <w14:ligatures w14:val="standardContextual"/>
+              </w:rPr>
+              <w:tab/>
+            </w:r>
+            <w:r>
+              <w:rPr>
+                <w:rStyle w:val="Hyperlink"/>
+                <w:noProof/>
+              </w:rPr>
+              <w:t>Bài toán kinh doanh  [BẮT BUỘC]</w:t>
+            </w:r>
+            <w:r>
+              <w:rPr>
+                <w:noProof/>
+                <w:webHidden/>
+              </w:rPr>
+              <w:tab/>
+            </w:r>
+            <w:r>
+              <w:rPr>
+                <w:noProof/>
+                <w:webHidden/>
+              </w:rPr>
+              <w:fldChar w:fldCharType="begin"/>
+            </w:r>
+            <w:r>
+              <w:rPr>
+                <w:noProof/>
+                <w:webHidden/>
+              </w:rPr>
+              <w:instrText xml:space="preserve"> PAGEREF _Toc237935603 \h </w:instrText>
+            </w:r>
+            <w:r>
+              <w:rPr>
+                <w:noProof/>
+                <w:webHidden/>
+              </w:rPr>
+            </w:r>
+            <w:r>
+              <w:rPr>
+                <w:noProof/>
+                <w:webHidden/>
+              </w:rPr>
+              <w:fldChar w:fldCharType="separate"/>
+            </w:r>
+            <w:r>
+              <w:rPr>
+                <w:noProof/>
+                <w:webHidden/>
+              </w:rPr>
+              <w:t>6</w:t>
+            </w:r>
+            <w:r>
+              <w:rPr>
+                <w:noProof/>
+                <w:webHidden/>
+              </w:rPr>
+              <w:fldChar w:fldCharType="end"/>
+            </w:r>
+          </w:hyperlink>
+        </w:p>
+        <w:p>
+          <w:pPr>
+            <w:pStyle w:val="TOC1"/>
+            <w:tabs>
+              <w:tab w:val="left" w:pos="440"/>
+              <w:tab w:val="right" w:leader="dot" w:pos="9350"/>
+            </w:tabs>
+            <w:rPr>
+              <w:rFonts w:cstheme="minorBidi"/>
+              <w:noProof/>
+              <w:kern w:val="2"/>
+              <w:sz w:val="24"/>
+              <w:szCs w:val="24"/>
+              <w:lang w:val="vi-VN" w:eastAsia="vi-VN"/>
+              <w14:ligatures w14:val="standardContextual"/>
+            </w:rPr>
+          </w:pPr>
+          <w:hyperlink w:anchor="_Toc237935604" w:history="1">
+            <w:r>
+              <w:rPr>
+                <w:rStyle w:val="Hyperlink"/>
+                <w:noProof/>
+              </w:rPr>
+              <w:t>4.</w:t>
+            </w:r>
+            <w:r>
+              <w:rPr>
+                <w:rFonts w:cstheme="minorBidi"/>
+                <w:noProof/>
+                <w:kern w:val="2"/>
+                <w:sz w:val="24"/>
+                <w:szCs w:val="24"/>
+                <w:lang w:val="vi-VN" w:eastAsia="vi-VN"/>
+                <w14:ligatures w14:val="standardContextual"/>
+              </w:rPr>
+              <w:tab/>
+            </w:r>
+            <w:r>
+              <w:rPr>
+                <w:rStyle w:val="Hyperlink"/>
+                <w:noProof/>
+              </w:rPr>
+              <w:t>Mục tiêu &amp; giá trị kinh doanh  [BẮT BUỘC]</w:t>
+            </w:r>
+            <w:r>
+              <w:rPr>
+                <w:noProof/>
+                <w:webHidden/>
+              </w:rPr>
+              <w:tab/>
+            </w:r>
+            <w:r>
+              <w:rPr>
+                <w:noProof/>
+                <w:webHidden/>
+              </w:rPr>
+              <w:fldChar w:fldCharType="begin"/>
+            </w:r>
+            <w:r>
+              <w:rPr>
+                <w:noProof/>
+                <w:webHidden/>
+              </w:rPr>
+              <w:instrText xml:space="preserve"> PAGEREF _Toc237935604 \h </w:instrText>
+            </w:r>
+            <w:r>
+              <w:rPr>
+                <w:noProof/>
+                <w:webHidden/>
+              </w:rPr>
+            </w:r>
+            <w:r>
+              <w:rPr>
+                <w:noProof/>
+                <w:webHidden/>
+              </w:rPr>
+              <w:fldChar w:fldCharType="separate"/>
+            </w:r>
+            <w:r>
+              <w:rPr>
+                <w:noProof/>
+                <w:webHidden/>
+              </w:rPr>
+              <w:t>6</w:t>
+            </w:r>
+            <w:r>
+              <w:rPr>
+                <w:noProof/>
+                <w:webHidden/>
+              </w:rPr>
+              <w:fldChar w:fldCharType="end"/>
+            </w:r>
+          </w:hyperlink>
+        </w:p>
+        <w:p>
+          <w:pPr>
+            <w:pStyle w:val="TOC2"/>
+            <w:tabs>
+              <w:tab w:val="left" w:pos="960"/>
+              <w:tab w:val="right" w:leader="dot" w:pos="9350"/>
+            </w:tabs>
+            <w:rPr>
+              <w:rFonts w:cstheme="minorBidi"/>
+              <w:noProof/>
+              <w:kern w:val="2"/>
+              <w:sz w:val="24"/>
+              <w:szCs w:val="24"/>
+              <w:lang w:val="vi-VN" w:eastAsia="vi-VN"/>
+              <w14:ligatures w14:val="standardContextual"/>
+            </w:rPr>
+          </w:pPr>
+          <w:hyperlink w:anchor="_Toc237935605" w:history="1">
+            <w:r>
+              <w:rPr>
+                <w:rStyle w:val="Hyperlink"/>
+                <w:noProof/>
+              </w:rPr>
+              <w:t>4.1.</w:t>
+            </w:r>
+            <w:r>
+              <w:rPr>
+                <w:rFonts w:cstheme="minorBidi"/>
+                <w:noProof/>
+                <w:kern w:val="2"/>
+                <w:sz w:val="24"/>
+                <w:szCs w:val="24"/>
+                <w:lang w:val="vi-VN" w:eastAsia="vi-VN"/>
+                <w14:ligatures w14:val="standardContextual"/>
+              </w:rPr>
+              <w:tab/>
+            </w:r>
+            <w:r>
+              <w:rPr>
+                <w:rStyle w:val="Hyperlink"/>
+                <w:noProof/>
+              </w:rPr>
+              <w:t>Đối tượng đọc tài liệu</w:t>
+            </w:r>
+            <w:r>
+              <w:rPr>
+                <w:noProof/>
+                <w:webHidden/>
+              </w:rPr>
+              <w:tab/>
+            </w:r>
+            <w:r>
+              <w:rPr>
+                <w:noProof/>
+                <w:webHidden/>
+              </w:rPr>
+              <w:fldChar w:fldCharType="begin"/>
+            </w:r>
+            <w:r>
+              <w:rPr>
+                <w:noProof/>
+                <w:webHidden/>
+              </w:rPr>
+              <w:instrText xml:space="preserve"> PAGEREF _Toc237935605 \h </w:instrText>
+            </w:r>
+            <w:r>
+              <w:rPr>
+                <w:noProof/>
+                <w:webHidden/>
+              </w:rPr>
+            </w:r>
+            <w:r>
+              <w:rPr>
+                <w:noProof/>
+                <w:webHidden/>
+              </w:rPr>
+              <w:fldChar w:fldCharType="separate"/>
+            </w:r>
+            <w:r>
+              <w:rPr>
+                <w:noProof/>
+                <w:webHidden/>
+              </w:rPr>
+              <w:t>6</w:t>
+            </w:r>
+            <w:r>
+              <w:rPr>
+                <w:noProof/>
+                <w:webHidden/>
+              </w:rPr>
+              <w:fldChar w:fldCharType="end"/>
+            </w:r>
+          </w:hyperlink>
+        </w:p>
+        <w:p>
+          <w:pPr>
+            <w:pStyle w:val="TOC1"/>
+            <w:tabs>
+              <w:tab w:val="left" w:pos="440"/>
+              <w:tab w:val="right" w:leader="dot" w:pos="9350"/>
+            </w:tabs>
+            <w:rPr>
+              <w:rFonts w:cstheme="minorBidi"/>
+              <w:noProof/>
+              <w:kern w:val="2"/>
+              <w:sz w:val="24"/>
+              <w:szCs w:val="24"/>
+              <w:lang w:val="vi-VN" w:eastAsia="vi-VN"/>
+              <w14:ligatures w14:val="standardContextual"/>
+            </w:rPr>
+          </w:pPr>
+          <w:hyperlink w:anchor="_Toc237935606" w:history="1">
+            <w:r>
+              <w:rPr>
+                <w:rStyle w:val="Hyperlink"/>
+                <w:noProof/>
+              </w:rPr>
+              <w:t>5.</w:t>
+            </w:r>
+            <w:r>
+              <w:rPr>
+                <w:rFonts w:cstheme="minorBidi"/>
+                <w:noProof/>
+                <w:kern w:val="2"/>
+                <w:sz w:val="24"/>
+                <w:szCs w:val="24"/>
+                <w:lang w:val="vi-VN" w:eastAsia="vi-VN"/>
+                <w14:ligatures w14:val="standardContextual"/>
+              </w:rPr>
+              <w:tab/>
+            </w:r>
+            <w:r>
+              <w:rPr>
+                <w:rStyle w:val="Hyperlink"/>
+                <w:noProof/>
+              </w:rPr>
+              <w:t>Phạm vi (Scope) [BẮT BUỘC]</w:t>
+            </w:r>
+            <w:r>
+              <w:rPr>
+                <w:noProof/>
+                <w:webHidden/>
+              </w:rPr>
+              <w:tab/>
+            </w:r>
+            <w:r>
+              <w:rPr>
+                <w:noProof/>
+                <w:webHidden/>
+              </w:rPr>
+              <w:fldChar w:fldCharType="begin"/>
+            </w:r>
+            <w:r>
+              <w:rPr>
+                <w:noProof/>
+                <w:webHidden/>
+              </w:rPr>
+              <w:instrText xml:space="preserve"> PAGEREF _Toc237935606 \h </w:instrText>
+            </w:r>
+            <w:r>
+              <w:rPr>
+                <w:noProof/>
+                <w:webHidden/>
+              </w:rPr>
+            </w:r>
+            <w:r>
+              <w:rPr>
+                <w:noProof/>
+                <w:webHidden/>
+              </w:rPr>
+              <w:fldChar w:fldCharType="separate"/>
+            </w:r>
+            <w:r>
+              <w:rPr>
+                <w:noProof/>
+                <w:webHidden/>
+              </w:rPr>
+              <w:t>7</w:t>
+            </w:r>
+            <w:r>
+              <w:rPr>
+                <w:noProof/>
+                <w:webHidden/>
+              </w:rPr>
+              <w:fldChar w:fldCharType="end"/>
+            </w:r>
+          </w:hyperlink>
+        </w:p>
+        <w:p>
+          <w:pPr>
+            <w:pStyle w:val="TOC2"/>
+            <w:tabs>
+              <w:tab w:val="left" w:pos="960"/>
+              <w:tab w:val="right" w:leader="dot" w:pos="9350"/>
+            </w:tabs>
+            <w:rPr>
+              <w:rFonts w:cstheme="minorBidi"/>
+              <w:noProof/>
+              <w:kern w:val="2"/>
+              <w:sz w:val="24"/>
+              <w:szCs w:val="24"/>
+              <w:lang w:val="vi-VN" w:eastAsia="vi-VN"/>
+              <w14:ligatures w14:val="standardContextual"/>
+            </w:rPr>
+          </w:pPr>
+          <w:hyperlink w:anchor="_Toc237935607" w:history="1">
+            <w:r>
+              <w:rPr>
+                <w:rStyle w:val="Hyperlink"/>
+                <w:noProof/>
+              </w:rPr>
+              <w:t>5.1.</w:t>
+            </w:r>
+            <w:r>
+              <w:rPr>
+                <w:rFonts w:cstheme="minorBidi"/>
+                <w:noProof/>
+                <w:kern w:val="2"/>
+                <w:sz w:val="24"/>
+                <w:szCs w:val="24"/>
+                <w:lang w:val="vi-VN" w:eastAsia="vi-VN"/>
+                <w14:ligatures w14:val="standardContextual"/>
+              </w:rPr>
+              <w:tab/>
+            </w:r>
+            <w:r>
+              <w:rPr>
+                <w:rStyle w:val="Hyperlink"/>
+                <w:noProof/>
+              </w:rPr>
+              <w:t>Trong phạm vi (In scope)</w:t>
+            </w:r>
+            <w:r>
+              <w:rPr>
+                <w:noProof/>
+                <w:webHidden/>
+              </w:rPr>
+              <w:tab/>
+            </w:r>
+            <w:r>
+              <w:rPr>
+                <w:noProof/>
+                <w:webHidden/>
+              </w:rPr>
+              <w:fldChar w:fldCharType="begin"/>
+            </w:r>
+            <w:r>
+              <w:rPr>
+                <w:noProof/>
+                <w:webHidden/>
+              </w:rPr>
+              <w:instrText xml:space="preserve"> PAGEREF _Toc237935607 \h </w:instrText>
+            </w:r>
+            <w:r>
+              <w:rPr>
+                <w:noProof/>
+                <w:webHidden/>
+              </w:rPr>
+            </w:r>
+            <w:r>
+              <w:rPr>
+                <w:noProof/>
+                <w:webHidden/>
+              </w:rPr>
+              <w:fldChar w:fldCharType="separate"/>
+            </w:r>
+            <w:r>
+              <w:rPr>
+                <w:noProof/>
+                <w:webHidden/>
+              </w:rPr>
+              <w:t>7</w:t>
+            </w:r>
+            <w:r>
+              <w:rPr>
+                <w:noProof/>
+                <w:webHidden/>
+              </w:rPr>
+              <w:fldChar w:fldCharType="end"/>
+            </w:r>
+          </w:hyperlink>
+        </w:p>
+        <w:p>
+          <w:pPr>
+            <w:pStyle w:val="TOC2"/>
+            <w:tabs>
+              <w:tab w:val="left" w:pos="960"/>
+              <w:tab w:val="right" w:leader="dot" w:pos="9350"/>
+            </w:tabs>
+            <w:rPr>
+              <w:rFonts w:cstheme="minorBidi"/>
+              <w:noProof/>
+              <w:kern w:val="2"/>
+              <w:sz w:val="24"/>
+              <w:szCs w:val="24"/>
+              <w:lang w:val="vi-VN" w:eastAsia="vi-VN"/>
+              <w14:ligatures w14:val="standardContextual"/>
+            </w:rPr>
+          </w:pPr>
+          <w:hyperlink w:anchor="_Toc237935608" w:history="1">
+            <w:r>
+              <w:rPr>
+                <w:rStyle w:val="Hyperlink"/>
+                <w:noProof/>
+              </w:rPr>
+              <w:t>5.2.</w:t>
+            </w:r>
+            <w:r>
+              <w:rPr>
+                <w:rFonts w:cstheme="minorBidi"/>
+                <w:noProof/>
+                <w:kern w:val="2"/>
+                <w:sz w:val="24"/>
+                <w:szCs w:val="24"/>
+                <w:lang w:val="vi-VN" w:eastAsia="vi-VN"/>
+                <w14:ligatures w14:val="standardContextual"/>
+              </w:rPr>
+              <w:tab/>
+            </w:r>
+            <w:r>
+              <w:rPr>
+                <w:rStyle w:val="Hyperlink"/>
+                <w:noProof/>
+              </w:rPr>
+              <w:t>Ngoài phạm vi (Out of scope)</w:t>
+            </w:r>
+            <w:r>
+              <w:rPr>
+                <w:noProof/>
+                <w:webHidden/>
+              </w:rPr>
+              <w:tab/>
+            </w:r>
+            <w:r>
+              <w:rPr>
+                <w:noProof/>
+                <w:webHidden/>
+              </w:rPr>
+              <w:fldChar w:fldCharType="begin"/>
+            </w:r>
+            <w:r>
+              <w:rPr>
+                <w:noProof/>
+                <w:webHidden/>
+              </w:rPr>
+              <w:instrText xml:space="preserve"> PAGEREF _Toc237935608 \h </w:instrText>
+            </w:r>
+            <w:r>
+              <w:rPr>
+                <w:noProof/>
+                <w:webHidden/>
+              </w:rPr>
+            </w:r>
+            <w:r>
+              <w:rPr>
+                <w:noProof/>
+                <w:webHidden/>
+              </w:rPr>
+              <w:fldChar w:fldCharType="separate"/>
+            </w:r>
+            <w:r>
+              <w:rPr>
+                <w:noProof/>
+                <w:webHidden/>
+              </w:rPr>
+              <w:t>7</w:t>
+            </w:r>
+            <w:r>
+              <w:rPr>
+                <w:noProof/>
+                <w:webHidden/>
+              </w:rPr>
+              <w:fldChar w:fldCharType="end"/>
+            </w:r>
+          </w:hyperlink>
+        </w:p>
+        <w:p>
+          <w:pPr>
+            <w:pStyle w:val="TOC2"/>
+            <w:tabs>
+              <w:tab w:val="left" w:pos="960"/>
+              <w:tab w:val="right" w:leader="dot" w:pos="9350"/>
+            </w:tabs>
+            <w:rPr>
+              <w:rFonts w:cstheme="minorBidi"/>
+              <w:noProof/>
+              <w:kern w:val="2"/>
+              <w:sz w:val="24"/>
+              <w:szCs w:val="24"/>
+              <w:lang w:val="vi-VN" w:eastAsia="vi-VN"/>
+              <w14:ligatures w14:val="standardContextual"/>
+            </w:rPr>
+          </w:pPr>
+          <w:hyperlink w:anchor="_Toc237935609" w:history="1">
+            <w:r>
+              <w:rPr>
+                <w:rStyle w:val="Hyperlink"/>
+                <w:noProof/>
+              </w:rPr>
+              <w:t>5.3.</w:t>
+            </w:r>
+            <w:r>
+              <w:rPr>
+                <w:rFonts w:cstheme="minorBidi"/>
+                <w:noProof/>
+                <w:kern w:val="2"/>
+                <w:sz w:val="24"/>
+                <w:szCs w:val="24"/>
+                <w:lang w:val="vi-VN" w:eastAsia="vi-VN"/>
+                <w14:ligatures w14:val="standardContextual"/>
+              </w:rPr>
+              <w:tab/>
+            </w:r>
+            <w:r>
+              <w:rPr>
+                <w:rStyle w:val="Hyperlink"/>
+                <w:noProof/>
+              </w:rPr>
+              <w:t>Đối tượng / hệ thống liên quan</w:t>
+            </w:r>
+            <w:r>
+              <w:rPr>
+                <w:noProof/>
+                <w:webHidden/>
+              </w:rPr>
+              <w:tab/>
+            </w:r>
+            <w:r>
+              <w:rPr>
+                <w:noProof/>
+                <w:webHidden/>
+              </w:rPr>
+              <w:fldChar w:fldCharType="begin"/>
+            </w:r>
+            <w:r>
+              <w:rPr>
+                <w:noProof/>
+                <w:webHidden/>
+              </w:rPr>
+              <w:instrText xml:space="preserve"> PAGEREF _Toc237935609 \h </w:instrText>
+            </w:r>
+            <w:r>
+              <w:rPr>
+                <w:noProof/>
+                <w:webHidden/>
+              </w:rPr>
+            </w:r>
+            <w:r>
+              <w:rPr>
+                <w:noProof/>
+                <w:webHidden/>
+              </w:rPr>
+              <w:fldChar w:fldCharType="separate"/>
+            </w:r>
+            <w:r>
+              <w:rPr>
+                <w:noProof/>
+                <w:webHidden/>
+              </w:rPr>
+              <w:t>7</w:t>
+            </w:r>
+            <w:r>
+              <w:rPr>
+                <w:noProof/>
+                <w:webHidden/>
+              </w:rPr>
+              <w:fldChar w:fldCharType="end"/>
+            </w:r>
+          </w:hyperlink>
+        </w:p>
+        <w:p>
+          <w:pPr>
+            <w:pStyle w:val="TOC1"/>
+            <w:tabs>
+              <w:tab w:val="left" w:pos="440"/>
+              <w:tab w:val="right" w:leader="dot" w:pos="9350"/>
+            </w:tabs>
+            <w:rPr>
+              <w:rFonts w:cstheme="minorBidi"/>
+              <w:noProof/>
+              <w:kern w:val="2"/>
+              <w:sz w:val="24"/>
+              <w:szCs w:val="24"/>
+              <w:lang w:val="vi-VN" w:eastAsia="vi-VN"/>
+              <w14:ligatures w14:val="standardContextual"/>
+            </w:rPr>
+          </w:pPr>
+          <w:hyperlink w:anchor="_Toc237935610" w:history="1">
+            <w:r>
+              <w:rPr>
+                <w:rStyle w:val="Hyperlink"/>
+                <w:noProof/>
+              </w:rPr>
+              <w:t>6.</w:t>
+            </w:r>
+            <w:r>
+              <w:rPr>
+                <w:rFonts w:cstheme="minorBidi"/>
+                <w:noProof/>
+                <w:kern w:val="2"/>
+                <w:sz w:val="24"/>
+                <w:szCs w:val="24"/>
+                <w:lang w:val="vi-VN" w:eastAsia="vi-VN"/>
+                <w14:ligatures w14:val="standardContextual"/>
+              </w:rPr>
+              <w:tab/>
+            </w:r>
+            <w:r>
+              <w:rPr>
+                <w:rStyle w:val="Hyperlink"/>
+                <w:noProof/>
+              </w:rPr>
+              <w:t>Đối tượng tham gia (Actors) [BẮT BUỘC]</w:t>
+            </w:r>
+            <w:r>
+              <w:rPr>
+                <w:noProof/>
+                <w:webHidden/>
+              </w:rPr>
+              <w:tab/>
+            </w:r>
+            <w:r>
+              <w:rPr>
+                <w:noProof/>
+                <w:webHidden/>
+              </w:rPr>
+              <w:fldChar w:fldCharType="begin"/>
+            </w:r>
+            <w:r>
+              <w:rPr>
+                <w:noProof/>
+                <w:webHidden/>
+              </w:rPr>
+              <w:instrText xml:space="preserve"> PAGEREF _Toc237935610 \h </w:instrText>
+            </w:r>
+            <w:r>
+              <w:rPr>
+                <w:noProof/>
+                <w:webHidden/>
+              </w:rPr>
+            </w:r>
+            <w:r>
+              <w:rPr>
+                <w:noProof/>
+                <w:webHidden/>
+              </w:rPr>
+              <w:fldChar w:fldCharType="separate"/>
+            </w:r>
+            <w:r>
+              <w:rPr>
+                <w:noProof/>
+                <w:webHidden/>
+              </w:rPr>
+              <w:t>8</w:t>
+            </w:r>
+            <w:r>
+              <w:rPr>
+                <w:noProof/>
+                <w:webHidden/>
+              </w:rPr>
+              <w:fldChar w:fldCharType="end"/>
+            </w:r>
+          </w:hyperlink>
+        </w:p>
+        <w:p>
+          <w:pPr>
+            <w:pStyle w:val="TOC1"/>
+            <w:tabs>
+              <w:tab w:val="left" w:pos="440"/>
+              <w:tab w:val="right" w:leader="dot" w:pos="9350"/>
+            </w:tabs>
+            <w:rPr>
+              <w:rFonts w:cstheme="minorBidi"/>
+              <w:noProof/>
+              <w:kern w:val="2"/>
+              <w:sz w:val="24"/>
+              <w:szCs w:val="24"/>
+              <w:lang w:val="vi-VN" w:eastAsia="vi-VN"/>
+              <w14:ligatures w14:val="standardContextual"/>
+            </w:rPr>
+          </w:pPr>
+          <w:hyperlink w:anchor="_Toc237935611" w:history="1">
+            <w:r>
+              <w:rPr>
+                <w:rStyle w:val="Hyperlink"/>
+                <w:noProof/>
+              </w:rPr>
+              <w:t>7.</w:t>
+            </w:r>
+            <w:r>
+              <w:rPr>
+                <w:rFonts w:cstheme="minorBidi"/>
+                <w:noProof/>
+                <w:kern w:val="2"/>
+                <w:sz w:val="24"/>
+                <w:szCs w:val="24"/>
+                <w:lang w:val="vi-VN" w:eastAsia="vi-VN"/>
+                <w14:ligatures w14:val="standardContextual"/>
+              </w:rPr>
+              <w:tab/>
+            </w:r>
+            <w:r>
+              <w:rPr>
+                <w:rStyle w:val="Hyperlink"/>
+                <w:noProof/>
+              </w:rPr>
+              <w:t>Quy trình nghiệp vụ (Business Process)  [BẮT BUỘC]</w:t>
+            </w:r>
+            <w:r>
+              <w:rPr>
+                <w:noProof/>
+                <w:webHidden/>
+              </w:rPr>
+              <w:tab/>
+            </w:r>
+            <w:r>
+              <w:rPr>
+                <w:noProof/>
+                <w:webHidden/>
+              </w:rPr>
+              <w:fldChar w:fldCharType="begin"/>
+            </w:r>
+            <w:r>
+              <w:rPr>
+                <w:noProof/>
+                <w:webHidden/>
+              </w:rPr>
+              <w:instrText xml:space="preserve"> PAGEREF _Toc237935611 \h </w:instrText>
+            </w:r>
+            <w:r>
+              <w:rPr>
+                <w:noProof/>
+                <w:webHidden/>
+              </w:rPr>
+            </w:r>
+            <w:r>
+              <w:rPr>
+                <w:noProof/>
+                <w:webHidden/>
+              </w:rPr>
+              <w:fldChar w:fldCharType="separate"/>
+            </w:r>
+            <w:r>
+              <w:rPr>
+                <w:noProof/>
+                <w:webHidden/>
+              </w:rPr>
+              <w:t>9</w:t>
+            </w:r>
+            <w:r>
+              <w:rPr>
+                <w:noProof/>
+                <w:webHidden/>
+              </w:rPr>
+              <w:fldChar w:fldCharType="end"/>
+            </w:r>
+          </w:hyperlink>
+        </w:p>
+        <w:p>
+          <w:pPr>
+            <w:pStyle w:val="TOC2"/>
+            <w:tabs>
+              <w:tab w:val="left" w:pos="960"/>
+              <w:tab w:val="right" w:leader="dot" w:pos="9350"/>
+            </w:tabs>
+            <w:rPr>
+              <w:rFonts w:cstheme="minorBidi"/>
+              <w:noProof/>
+              <w:kern w:val="2"/>
+              <w:sz w:val="24"/>
+              <w:szCs w:val="24"/>
+              <w:lang w:val="vi-VN" w:eastAsia="vi-VN"/>
+              <w14:ligatures w14:val="standardContextual"/>
+            </w:rPr>
+          </w:pPr>
+          <w:hyperlink w:anchor="_Toc237935612" w:history="1">
+            <w:r>
+              <w:rPr>
+                <w:rStyle w:val="Hyperlink"/>
+                <w:noProof/>
+              </w:rPr>
+              <w:t>7.1.</w:t>
+            </w:r>
+            <w:r>
+              <w:rPr>
+                <w:rFonts w:cstheme="minorBidi"/>
+                <w:noProof/>
+                <w:kern w:val="2"/>
+                <w:sz w:val="24"/>
+                <w:szCs w:val="24"/>
+                <w:lang w:val="vi-VN" w:eastAsia="vi-VN"/>
+                <w14:ligatures w14:val="standardContextual"/>
+              </w:rPr>
+              <w:tab/>
+            </w:r>
+            <w:r>
+              <w:rPr>
+                <w:rStyle w:val="Hyperlink"/>
+                <w:noProof/>
+              </w:rPr>
+              <w:t>Quy trình hiện tại (As-Is)</w:t>
+            </w:r>
+            <w:r>
+              <w:rPr>
+                <w:noProof/>
+                <w:webHidden/>
+              </w:rPr>
+              <w:tab/>
+            </w:r>
+            <w:r>
+              <w:rPr>
+                <w:noProof/>
+                <w:webHidden/>
+              </w:rPr>
+              <w:fldChar w:fldCharType="begin"/>
+            </w:r>
+            <w:r>
+              <w:rPr>
+                <w:noProof/>
+                <w:webHidden/>
+              </w:rPr>
+              <w:instrText xml:space="preserve"> PAGEREF _Toc237935612 \h </w:instrText>
+            </w:r>
+            <w:r>
+              <w:rPr>
+                <w:noProof/>
+                <w:webHidden/>
+              </w:rPr>
+            </w:r>
+            <w:r>
+              <w:rPr>
+                <w:noProof/>
+                <w:webHidden/>
+              </w:rPr>
+              <w:fldChar w:fldCharType="separate"/>
+            </w:r>
+            <w:r>
+              <w:rPr>
+                <w:noProof/>
+                <w:webHidden/>
+              </w:rPr>
+              <w:t>9</w:t>
+            </w:r>
+            <w:r>
+              <w:rPr>
+                <w:noProof/>
+                <w:webHidden/>
+              </w:rPr>
+              <w:fldChar w:fldCharType="end"/>
+            </w:r>
+          </w:hyperlink>
+        </w:p>
+        <w:p>
+          <w:pPr>
+            <w:pStyle w:val="TOC2"/>
+            <w:tabs>
+              <w:tab w:val="left" w:pos="960"/>
+              <w:tab w:val="right" w:leader="dot" w:pos="9350"/>
+            </w:tabs>
+            <w:rPr>
+              <w:rFonts w:cstheme="minorBidi"/>
+              <w:noProof/>
+              <w:kern w:val="2"/>
+              <w:sz w:val="24"/>
+              <w:szCs w:val="24"/>
+              <w:lang w:val="vi-VN" w:eastAsia="vi-VN"/>
+              <w14:ligatures w14:val="standardContextual"/>
+            </w:rPr>
+          </w:pPr>
+          <w:hyperlink w:anchor="_Toc237935613" w:history="1">
+            <w:r>
+              <w:rPr>
+                <w:rStyle w:val="Hyperlink"/>
+                <w:noProof/>
+              </w:rPr>
+              <w:t>7.2.</w:t>
+            </w:r>
+            <w:r>
+              <w:rPr>
+                <w:rFonts w:cstheme="minorBidi"/>
+                <w:noProof/>
+                <w:kern w:val="2"/>
+                <w:sz w:val="24"/>
+                <w:szCs w:val="24"/>
+                <w:lang w:val="vi-VN" w:eastAsia="vi-VN"/>
+                <w14:ligatures w14:val="standardContextual"/>
+              </w:rPr>
+              <w:tab/>
+            </w:r>
+            <w:r>
+              <w:rPr>
+                <w:rStyle w:val="Hyperlink"/>
+                <w:noProof/>
+              </w:rPr>
+              <w:t>Quy trình mục tiêu (To-Be)</w:t>
+            </w:r>
+            <w:r>
+              <w:rPr>
+                <w:noProof/>
+                <w:webHidden/>
+              </w:rPr>
+              <w:tab/>
+            </w:r>
+            <w:r>
+              <w:rPr>
+                <w:noProof/>
+                <w:webHidden/>
+              </w:rPr>
+              <w:fldChar w:fldCharType="begin"/>
+            </w:r>
+            <w:r>
+              <w:rPr>
+                <w:noProof/>
+                <w:webHidden/>
+              </w:rPr>
+              <w:instrText xml:space="preserve"> PAGEREF _Toc237935613 \h </w:instrText>
+            </w:r>
+            <w:r>
+              <w:rPr>
+                <w:noProof/>
+                <w:webHidden/>
+              </w:rPr>
+            </w:r>
+            <w:r>
+              <w:rPr>
+                <w:noProof/>
+                <w:webHidden/>
+              </w:rPr>
+              <w:fldChar w:fldCharType="separate"/>
+            </w:r>
+            <w:r>
+              <w:rPr>
+                <w:noProof/>
+                <w:webHidden/>
+              </w:rPr>
+              <w:t>9</w:t>
+            </w:r>
+            <w:r>
+              <w:rPr>
+                <w:noProof/>
+                <w:webHidden/>
+              </w:rPr>
+              <w:fldChar w:fldCharType="end"/>
+            </w:r>
+          </w:hyperlink>
+        </w:p>
+        <w:p>
+          <w:pPr>
+            <w:pStyle w:val="TOC1"/>
+            <w:tabs>
+              <w:tab w:val="left" w:pos="440"/>
+              <w:tab w:val="right" w:leader="dot" w:pos="9350"/>
+            </w:tabs>
+            <w:rPr>
+              <w:rFonts w:cstheme="minorBidi"/>
+              <w:noProof/>
+              <w:kern w:val="2"/>
+              <w:sz w:val="24"/>
+              <w:szCs w:val="24"/>
+              <w:lang w:val="vi-VN" w:eastAsia="vi-VN"/>
+              <w14:ligatures w14:val="standardContextual"/>
+            </w:rPr>
+          </w:pPr>
+          <w:hyperlink w:anchor="_Toc237935614" w:history="1">
+            <w:r>
+              <w:rPr>
+                <w:rStyle w:val="Hyperlink"/>
+                <w:noProof/>
+              </w:rPr>
+              <w:t>8.</w:t>
+            </w:r>
+            <w:r>
+              <w:rPr>
+                <w:rFonts w:cstheme="minorBidi"/>
+                <w:noProof/>
+                <w:kern w:val="2"/>
+                <w:sz w:val="24"/>
+                <w:szCs w:val="24"/>
+                <w:lang w:val="vi-VN" w:eastAsia="vi-VN"/>
+                <w14:ligatures w14:val="standardContextual"/>
+              </w:rPr>
+              <w:tab/>
+            </w:r>
+            <w:r>
+              <w:rPr>
+                <w:rStyle w:val="Hyperlink"/>
+                <w:noProof/>
+              </w:rPr>
+              <w:t>Yêu cầu nghiệp vụ (Business Requirements)  [BẮT BUỘC]</w:t>
+            </w:r>
+            <w:r>
+              <w:rPr>
+                <w:noProof/>
+                <w:webHidden/>
+              </w:rPr>
+              <w:tab/>
+            </w:r>
+            <w:r>
+              <w:rPr>
+                <w:noProof/>
+                <w:webHidden/>
+              </w:rPr>
+              <w:fldChar w:fldCharType="begin"/>
+            </w:r>
+            <w:r>
+              <w:rPr>
+                <w:noProof/>
+                <w:webHidden/>
+              </w:rPr>
+              <w:instrText xml:space="preserve"> PAGEREF _Toc237935614 \h </w:instrText>
+            </w:r>
+            <w:r>
+              <w:rPr>
+                <w:noProof/>
+                <w:webHidden/>
+              </w:rPr>
+            </w:r>
+            <w:r>
+              <w:rPr>
+                <w:noProof/>
+                <w:webHidden/>
+              </w:rPr>
+              <w:fldChar w:fldCharType="separate"/>
+            </w:r>
+            <w:r>
+              <w:rPr>
+                <w:noProof/>
+                <w:webHidden/>
+              </w:rPr>
+              <w:t>10</w:t>
+            </w:r>
+            <w:r>
+              <w:rPr>
+                <w:noProof/>
+                <w:webHidden/>
+              </w:rPr>
+              <w:fldChar w:fldCharType="end"/>
+            </w:r>
+          </w:hyperlink>
+        </w:p>
+        <w:p>
+          <w:pPr>
+            <w:pStyle w:val="TOC1"/>
+            <w:tabs>
+              <w:tab w:val="left" w:pos="440"/>
+              <w:tab w:val="right" w:leader="dot" w:pos="9350"/>
+            </w:tabs>
+            <w:rPr>
+              <w:rFonts w:cstheme="minorBidi"/>
+              <w:noProof/>
+              <w:kern w:val="2"/>
+              <w:sz w:val="24"/>
+              <w:szCs w:val="24"/>
+              <w:lang w:val="vi-VN" w:eastAsia="vi-VN"/>
+              <w14:ligatures w14:val="standardContextual"/>
+            </w:rPr>
+          </w:pPr>
+          <w:hyperlink w:anchor="_Toc237935615" w:history="1">
+            <w:r>
+              <w:rPr>
+                <w:rStyle w:val="Hyperlink"/>
+                <w:noProof/>
+              </w:rPr>
+              <w:t>9.</w:t>
+            </w:r>
+            <w:r>
+              <w:rPr>
+                <w:rFonts w:cstheme="minorBidi"/>
+                <w:noProof/>
+                <w:kern w:val="2"/>
+                <w:sz w:val="24"/>
+                <w:szCs w:val="24"/>
+                <w:lang w:val="vi-VN" w:eastAsia="vi-VN"/>
+                <w14:ligatures w14:val="standardContextual"/>
+              </w:rPr>
+              <w:tab/>
+            </w:r>
+            <w:r>
+              <w:rPr>
+                <w:rStyle w:val="Hyperlink"/>
+                <w:noProof/>
+              </w:rPr>
+              <w:t>Quy tắc nghiệp vụ (Business Rules) [BẮT BUỘC]</w:t>
+            </w:r>
+            <w:r>
+              <w:rPr>
+                <w:noProof/>
+                <w:webHidden/>
+              </w:rPr>
+              <w:tab/>
+            </w:r>
+            <w:r>
+              <w:rPr>
+                <w:noProof/>
+                <w:webHidden/>
+              </w:rPr>
+              <w:fldChar w:fldCharType="begin"/>
+            </w:r>
+            <w:r>
+              <w:rPr>
+                <w:noProof/>
+                <w:webHidden/>
+              </w:rPr>
+              <w:instrText xml:space="preserve"> PAGEREF _Toc237935615 \h </w:instrText>
+            </w:r>
+            <w:r>
+              <w:rPr>
+                <w:noProof/>
+                <w:webHidden/>
+              </w:rPr>
+            </w:r>
+            <w:r>
+              <w:rPr>
+                <w:noProof/>
+                <w:webHidden/>
+              </w:rPr>
+              <w:fldChar w:fldCharType="separate"/>
+            </w:r>
+            <w:r>
+              <w:rPr>
+                <w:noProof/>
+                <w:webHidden/>
+              </w:rPr>
+              <w:t>11</w:t>
+            </w:r>
+            <w:r>
+              <w:rPr>
+                <w:noProof/>
+                <w:webHidden/>
+              </w:rPr>
+              <w:fldChar w:fldCharType="end"/>
+            </w:r>
+          </w:hyperlink>
+        </w:p>
+        <w:p>
+          <w:pPr>
+            <w:pStyle w:val="TOC1"/>
+            <w:tabs>
+              <w:tab w:val="left" w:pos="720"/>
+              <w:tab w:val="right" w:leader="dot" w:pos="9350"/>
+            </w:tabs>
+            <w:rPr>
+              <w:rFonts w:cstheme="minorBidi"/>
+              <w:noProof/>
+              <w:kern w:val="2"/>
+              <w:sz w:val="24"/>
+              <w:szCs w:val="24"/>
+              <w:lang w:val="vi-VN" w:eastAsia="vi-VN"/>
+              <w14:ligatures w14:val="standardContextual"/>
+            </w:rPr>
+          </w:pPr>
+          <w:hyperlink w:anchor="_Toc237935616" w:history="1">
+            <w:r>
+              <w:rPr>
+                <w:rStyle w:val="Hyperlink"/>
+                <w:noProof/>
+              </w:rPr>
+              <w:t>10.</w:t>
+            </w:r>
+            <w:r>
+              <w:rPr>
+                <w:rFonts w:cstheme="minorBidi"/>
+                <w:noProof/>
+                <w:kern w:val="2"/>
+                <w:sz w:val="24"/>
+                <w:szCs w:val="24"/>
+                <w:lang w:val="vi-VN" w:eastAsia="vi-VN"/>
+                <w14:ligatures w14:val="standardContextual"/>
+              </w:rPr>
+              <w:tab/>
+            </w:r>
+            <w:r>
+              <w:rPr>
+                <w:rStyle w:val="Hyperlink"/>
+                <w:noProof/>
+              </w:rPr>
+              <w:t>Trường hợp sử dụng (Use Cases) [KHUYẾN NGHỊ]</w:t>
+            </w:r>
+            <w:r>
+              <w:rPr>
+                <w:noProof/>
+                <w:webHidden/>
+              </w:rPr>
+              <w:tab/>
+            </w:r>
+            <w:r>
+              <w:rPr>
+                <w:noProof/>
+                <w:webHidden/>
+              </w:rPr>
+              <w:fldChar w:fldCharType="begin"/>
+            </w:r>
+            <w:r>
+              <w:rPr>
+                <w:noProof/>
+                <w:webHidden/>
+              </w:rPr>
+              <w:instrText xml:space="preserve"> PAGEREF _Toc237935616 \h </w:instrText>
+            </w:r>
+            <w:r>
+              <w:rPr>
+                <w:noProof/>
+                <w:webHidden/>
+              </w:rPr>
+            </w:r>
+            <w:r>
+              <w:rPr>
+                <w:noProof/>
+                <w:webHidden/>
+              </w:rPr>
+              <w:fldChar w:fldCharType="separate"/>
+            </w:r>
+            <w:r>
+              <w:rPr>
+                <w:noProof/>
+                <w:webHidden/>
+              </w:rPr>
+              <w:t>12</w:t>
+            </w:r>
+            <w:r>
+              <w:rPr>
+                <w:noProof/>
+                <w:webHidden/>
+              </w:rPr>
+              <w:fldChar w:fldCharType="end"/>
+            </w:r>
+          </w:hyperlink>
+        </w:p>
+        <w:p>
+          <w:pPr>
+            <w:pStyle w:val="TOC1"/>
+            <w:tabs>
+              <w:tab w:val="left" w:pos="720"/>
+              <w:tab w:val="right" w:leader="dot" w:pos="9350"/>
+            </w:tabs>
+            <w:rPr>
+              <w:rFonts w:cstheme="minorBidi"/>
+              <w:noProof/>
+              <w:kern w:val="2"/>
+              <w:sz w:val="24"/>
+              <w:szCs w:val="24"/>
+              <w:lang w:val="vi-VN" w:eastAsia="vi-VN"/>
+              <w14:ligatures w14:val="standardContextual"/>
+            </w:rPr>
+          </w:pPr>
+          <w:hyperlink w:anchor="_Toc237935617" w:history="1">
+            <w:r>
+              <w:rPr>
+                <w:rStyle w:val="Hyperlink"/>
+                <w:noProof/>
+              </w:rPr>
+              <w:t>11.</w:t>
+            </w:r>
+            <w:r>
+              <w:rPr>
+                <w:rFonts w:cstheme="minorBidi"/>
+                <w:noProof/>
+                <w:kern w:val="2"/>
+                <w:sz w:val="24"/>
+                <w:szCs w:val="24"/>
+                <w:lang w:val="vi-VN" w:eastAsia="vi-VN"/>
+                <w14:ligatures w14:val="standardContextual"/>
+              </w:rPr>
+              <w:tab/>
+            </w:r>
+            <w:r>
+              <w:rPr>
+                <w:rStyle w:val="Hyperlink"/>
+                <w:noProof/>
+              </w:rPr>
+              <w:t>Điều kiện đầu vào / đầu ra  [KHUYẾN NGHỊ]</w:t>
+            </w:r>
+            <w:r>
+              <w:rPr>
+                <w:noProof/>
+                <w:webHidden/>
+              </w:rPr>
+              <w:tab/>
+            </w:r>
+            <w:r>
+              <w:rPr>
+                <w:noProof/>
+                <w:webHidden/>
+              </w:rPr>
+              <w:fldChar w:fldCharType="begin"/>
+            </w:r>
+            <w:r>
+              <w:rPr>
+                <w:noProof/>
+                <w:webHidden/>
+              </w:rPr>
+              <w:instrText xml:space="preserve"> PAGEREF _Toc237935617 \h </w:instrText>
+            </w:r>
+            <w:r>
+              <w:rPr>
+                <w:noProof/>
+                <w:webHidden/>
+              </w:rPr>
+            </w:r>
+            <w:r>
+              <w:rPr>
+                <w:noProof/>
+                <w:webHidden/>
+              </w:rPr>
+              <w:fldChar w:fldCharType="separate"/>
+            </w:r>
+            <w:r>
+              <w:rPr>
+                <w:noProof/>
+                <w:webHidden/>
+              </w:rPr>
+              <w:t>13</w:t>
+            </w:r>
+            <w:r>
+              <w:rPr>
+                <w:noProof/>
+                <w:webHidden/>
+              </w:rPr>
+              <w:fldChar w:fldCharType="end"/>
+            </w:r>
+          </w:hyperlink>
+        </w:p>
+        <w:p>
+          <w:pPr>
+            <w:pStyle w:val="TOC1"/>
+            <w:tabs>
+              <w:tab w:val="left" w:pos="720"/>
+              <w:tab w:val="right" w:leader="dot" w:pos="9350"/>
+            </w:tabs>
+            <w:rPr>
+              <w:rFonts w:cstheme="minorBidi"/>
+              <w:noProof/>
+              <w:kern w:val="2"/>
+              <w:sz w:val="24"/>
+              <w:szCs w:val="24"/>
+              <w:lang w:val="vi-VN" w:eastAsia="vi-VN"/>
+              <w14:ligatures w14:val="standardContextual"/>
+            </w:rPr>
+          </w:pPr>
+          <w:hyperlink w:anchor="_Toc237935618" w:history="1">
+            <w:r>
+              <w:rPr>
+                <w:rStyle w:val="Hyperlink"/>
+                <w:noProof/>
+              </w:rPr>
+              <w:t>12.</w:t>
+            </w:r>
+            <w:r>
+              <w:rPr>
+                <w:rFonts w:cstheme="minorBidi"/>
+                <w:noProof/>
+                <w:kern w:val="2"/>
+                <w:sz w:val="24"/>
+                <w:szCs w:val="24"/>
+                <w:lang w:val="vi-VN" w:eastAsia="vi-VN"/>
+                <w14:ligatures w14:val="standardContextual"/>
+              </w:rPr>
+              <w:tab/>
+            </w:r>
+            <w:r>
+              <w:rPr>
+                <w:rStyle w:val="Hyperlink"/>
+                <w:noProof/>
+              </w:rPr>
+              <w:t>Trường hợp ngoại lệ nghiệp vụ  [KHUYẾN NGHỊ]</w:t>
+            </w:r>
+            <w:r>
+              <w:rPr>
+                <w:noProof/>
+                <w:webHidden/>
+              </w:rPr>
+              <w:tab/>
+            </w:r>
+            <w:r>
+              <w:rPr>
+                <w:noProof/>
+                <w:webHidden/>
+              </w:rPr>
+              <w:fldChar w:fldCharType="begin"/>
+            </w:r>
+            <w:r>
+              <w:rPr>
+                <w:noProof/>
+                <w:webHidden/>
+              </w:rPr>
+              <w:instrText xml:space="preserve"> PAGEREF _Toc237935618 \h </w:instrText>
+            </w:r>
+            <w:r>
+              <w:rPr>
+                <w:noProof/>
+                <w:webHidden/>
+              </w:rPr>
+            </w:r>
+            <w:r>
+              <w:rPr>
+                <w:noProof/>
+                <w:webHidden/>
+              </w:rPr>
+              <w:fldChar w:fldCharType="separate"/>
+            </w:r>
+            <w:r>
+              <w:rPr>
+                <w:noProof/>
+                <w:webHidden/>
+              </w:rPr>
+              <w:t>14</w:t>
+            </w:r>
+            <w:r>
+              <w:rPr>
+                <w:noProof/>
+                <w:webHidden/>
+              </w:rPr>
+              <w:fldChar w:fldCharType="end"/>
+            </w:r>
+          </w:hyperlink>
+        </w:p>
+        <w:p>
+          <w:pPr>
+            <w:pStyle w:val="TOC1"/>
+            <w:tabs>
+              <w:tab w:val="left" w:pos="720"/>
+              <w:tab w:val="right" w:leader="dot" w:pos="9350"/>
+            </w:tabs>
+            <w:rPr>
+              <w:rFonts w:cstheme="minorBidi"/>
+              <w:noProof/>
+              <w:kern w:val="2"/>
+              <w:sz w:val="24"/>
+              <w:szCs w:val="24"/>
+              <w:lang w:val="vi-VN" w:eastAsia="vi-VN"/>
+              <w14:ligatures w14:val="standardContextual"/>
+            </w:rPr>
+          </w:pPr>
+          <w:hyperlink w:anchor="_Toc237935619" w:history="1">
+            <w:r>
+              <w:rPr>
+                <w:rStyle w:val="Hyperlink"/>
+                <w:noProof/>
+              </w:rPr>
+              <w:t>13.</w:t>
+            </w:r>
+            <w:r>
+              <w:rPr>
+                <w:rFonts w:cstheme="minorBidi"/>
+                <w:noProof/>
+                <w:kern w:val="2"/>
+                <w:sz w:val="24"/>
+                <w:szCs w:val="24"/>
+                <w:lang w:val="vi-VN" w:eastAsia="vi-VN"/>
+                <w14:ligatures w14:val="standardContextual"/>
+              </w:rPr>
+              <w:tab/>
+            </w:r>
+            <w:r>
+              <w:rPr>
+                <w:rStyle w:val="Hyperlink"/>
+                <w:noProof/>
+              </w:rPr>
+              <w:t>Tiêu chí nghiệm thu nghiệp vụ  [BẮT BUỘC]</w:t>
+            </w:r>
+            <w:r>
+              <w:rPr>
+                <w:noProof/>
+                <w:webHidden/>
+              </w:rPr>
+              <w:tab/>
+            </w:r>
+            <w:r>
+              <w:rPr>
+                <w:noProof/>
+                <w:webHidden/>
+              </w:rPr>
+              <w:fldChar w:fldCharType="begin"/>
+            </w:r>
+            <w:r>
+              <w:rPr>
+                <w:noProof/>
+                <w:webHidden/>
+              </w:rPr>
+              <w:instrText xml:space="preserve"> PAGEREF _Toc237935619 \h </w:instrText>
+            </w:r>
+            <w:r>
+              <w:rPr>
+                <w:noProof/>
+                <w:webHidden/>
+              </w:rPr>
+            </w:r>
+            <w:r>
+              <w:rPr>
+                <w:noProof/>
+                <w:webHidden/>
+              </w:rPr>
+              <w:fldChar w:fldCharType="separate"/>
+            </w:r>
+            <w:r>
+              <w:rPr>
+                <w:noProof/>
+                <w:webHidden/>
+              </w:rPr>
+              <w:t>15</w:t>
+            </w:r>
+            <w:r>
+              <w:rPr>
+                <w:noProof/>
+                <w:webHidden/>
+              </w:rPr>
+              <w:fldChar w:fldCharType="end"/>
+            </w:r>
+          </w:hyperlink>
+        </w:p>
+        <w:p>
+          <w:pPr>
+            <w:pStyle w:val="TOC1"/>
+            <w:tabs>
+              <w:tab w:val="left" w:pos="720"/>
+              <w:tab w:val="right" w:leader="dot" w:pos="9350"/>
+            </w:tabs>
+            <w:rPr>
+              <w:rFonts w:cstheme="minorBidi"/>
+              <w:noProof/>
+              <w:kern w:val="2"/>
+              <w:sz w:val="24"/>
+              <w:szCs w:val="24"/>
+              <w:lang w:val="vi-VN" w:eastAsia="vi-VN"/>
+              <w14:ligatures w14:val="standardContextual"/>
+            </w:rPr>
+          </w:pPr>
+          <w:hyperlink w:anchor="_Toc237935620" w:history="1">
+            <w:r>
+              <w:rPr>
+                <w:rStyle w:val="Hyperlink"/>
+                <w:noProof/>
+              </w:rPr>
+              <w:t>14.</w:t>
+            </w:r>
+            <w:r>
+              <w:rPr>
+                <w:rFonts w:cstheme="minorBidi"/>
+                <w:noProof/>
+                <w:kern w:val="2"/>
+                <w:sz w:val="24"/>
+                <w:szCs w:val="24"/>
+                <w:lang w:val="vi-VN" w:eastAsia="vi-VN"/>
+                <w14:ligatures w14:val="standardContextual"/>
+              </w:rPr>
+              <w:tab/>
+            </w:r>
+            <w:r>
+              <w:rPr>
+                <w:rStyle w:val="Hyperlink"/>
+                <w:noProof/>
+              </w:rPr>
+              <w:t>Yêu cầu phi chức năng (mức mục tiêu)</w:t>
+            </w:r>
+            <w:r>
+              <w:rPr>
+                <w:noProof/>
+                <w:webHidden/>
+              </w:rPr>
+              <w:tab/>
+            </w:r>
+            <w:r>
+              <w:rPr>
+                <w:noProof/>
+                <w:webHidden/>
+              </w:rPr>
+              <w:fldChar w:fldCharType="begin"/>
+            </w:r>
+            <w:r>
+              <w:rPr>
+                <w:noProof/>
+                <w:webHidden/>
+              </w:rPr>
+              <w:instrText xml:space="preserve"> PAGEREF _Toc237935620 \h </w:instrText>
+            </w:r>
+            <w:r>
+              <w:rPr>
+                <w:noProof/>
+                <w:webHidden/>
+              </w:rPr>
+            </w:r>
+            <w:r>
+              <w:rPr>
+                <w:noProof/>
+                <w:webHidden/>
+              </w:rPr>
+              <w:fldChar w:fldCharType="separate"/>
+            </w:r>
+            <w:r>
+              <w:rPr>
+                <w:noProof/>
+                <w:webHidden/>
+              </w:rPr>
+              <w:t>16</w:t>
+            </w:r>
+            <w:r>
+              <w:rPr>
+                <w:noProof/>
+                <w:webHidden/>
+              </w:rPr>
+              <w:fldChar w:fldCharType="end"/>
+            </w:r>
+          </w:hyperlink>
+        </w:p>
+        <w:p>
+          <w:pPr>
+            <w:pStyle w:val="TOC1"/>
+            <w:tabs>
+              <w:tab w:val="left" w:pos="720"/>
+              <w:tab w:val="right" w:leader="dot" w:pos="9350"/>
+            </w:tabs>
+            <w:rPr>
+              <w:rFonts w:cstheme="minorBidi"/>
+              <w:noProof/>
+              <w:kern w:val="2"/>
+              <w:sz w:val="24"/>
+              <w:szCs w:val="24"/>
+              <w:lang w:val="vi-VN" w:eastAsia="vi-VN"/>
+              <w14:ligatures w14:val="standardContextual"/>
+            </w:rPr>
+          </w:pPr>
+          <w:hyperlink w:anchor="_Toc237935621" w:history="1">
+            <w:r>
+              <w:rPr>
+                <w:rStyle w:val="Hyperlink"/>
+                <w:noProof/>
+              </w:rPr>
+              <w:t>15.</w:t>
+            </w:r>
+            <w:r>
+              <w:rPr>
+                <w:rFonts w:cstheme="minorBidi"/>
+                <w:noProof/>
+                <w:kern w:val="2"/>
+                <w:sz w:val="24"/>
+                <w:szCs w:val="24"/>
+                <w:lang w:val="vi-VN" w:eastAsia="vi-VN"/>
+                <w14:ligatures w14:val="standardContextual"/>
+              </w:rPr>
+              <w:tab/>
+            </w:r>
+            <w:r>
+              <w:rPr>
+                <w:rStyle w:val="Hyperlink"/>
+                <w:noProof/>
+              </w:rPr>
+              <w:t>Giả định, ràng buộc &amp; phụ thuộc</w:t>
+            </w:r>
+            <w:r>
+              <w:rPr>
+                <w:noProof/>
+                <w:webHidden/>
+              </w:rPr>
+              <w:tab/>
+            </w:r>
+            <w:r>
+              <w:rPr>
+                <w:noProof/>
+                <w:webHidden/>
+              </w:rPr>
+              <w:fldChar w:fldCharType="begin"/>
+            </w:r>
+            <w:r>
+              <w:rPr>
+                <w:noProof/>
+                <w:webHidden/>
+              </w:rPr>
+              <w:instrText xml:space="preserve"> PAGEREF _Toc237935621 \h </w:instrText>
+            </w:r>
+            <w:r>
+              <w:rPr>
+                <w:noProof/>
+                <w:webHidden/>
+              </w:rPr>
+            </w:r>
+            <w:r>
+              <w:rPr>
+                <w:noProof/>
+                <w:webHidden/>
+              </w:rPr>
+              <w:fldChar w:fldCharType="separate"/>
+            </w:r>
+            <w:r>
+              <w:rPr>
+                <w:noProof/>
+                <w:webHidden/>
+              </w:rPr>
+              <w:t>17</w:t>
+            </w:r>
+            <w:r>
+              <w:rPr>
+                <w:noProof/>
+                <w:webHidden/>
+              </w:rPr>
+              <w:fldChar w:fldCharType="end"/>
+            </w:r>
+          </w:hyperlink>
+        </w:p>
+        <w:p>
+          <w:pPr>
+            <w:pStyle w:val="TOC2"/>
+            <w:tabs>
+              <w:tab w:val="left" w:pos="960"/>
+              <w:tab w:val="right" w:leader="dot" w:pos="9350"/>
+            </w:tabs>
+            <w:rPr>
+              <w:rFonts w:cstheme="minorBidi"/>
+              <w:noProof/>
+              <w:kern w:val="2"/>
+              <w:sz w:val="24"/>
+              <w:szCs w:val="24"/>
+              <w:lang w:val="vi-VN" w:eastAsia="vi-VN"/>
+              <w14:ligatures w14:val="standardContextual"/>
+            </w:rPr>
+          </w:pPr>
+          <w:hyperlink w:anchor="_Toc237935622" w:history="1">
+            <w:r>
+              <w:rPr>
+                <w:rStyle w:val="Hyperlink"/>
+                <w:noProof/>
+              </w:rPr>
+              <w:t>15.1.</w:t>
+            </w:r>
+            <w:r>
+              <w:rPr>
+                <w:rFonts w:cstheme="minorBidi"/>
+                <w:noProof/>
+                <w:kern w:val="2"/>
+                <w:sz w:val="24"/>
+                <w:szCs w:val="24"/>
+                <w:lang w:val="vi-VN" w:eastAsia="vi-VN"/>
+                <w14:ligatures w14:val="standardContextual"/>
+              </w:rPr>
+              <w:tab/>
+            </w:r>
+            <w:r>
+              <w:rPr>
+                <w:rStyle w:val="Hyperlink"/>
+                <w:noProof/>
+              </w:rPr>
+              <w:t>Giả định (Assumptions)</w:t>
+            </w:r>
+            <w:r>
+              <w:rPr>
+                <w:noProof/>
+                <w:webHidden/>
+              </w:rPr>
+              <w:tab/>
+            </w:r>
+            <w:r>
+              <w:rPr>
+                <w:noProof/>
+                <w:webHidden/>
+              </w:rPr>
+              <w:fldChar w:fldCharType="begin"/>
+            </w:r>
+            <w:r>
+              <w:rPr>
+                <w:noProof/>
+                <w:webHidden/>
+              </w:rPr>
+              <w:instrText xml:space="preserve"> PAGEREF _Toc237935622 \h </w:instrText>
+            </w:r>
+            <w:r>
+              <w:rPr>
+                <w:noProof/>
+                <w:webHidden/>
+              </w:rPr>
+            </w:r>
+            <w:r>
+              <w:rPr>
+                <w:noProof/>
+                <w:webHidden/>
+              </w:rPr>
+              <w:fldChar w:fldCharType="separate"/>
+            </w:r>
+            <w:r>
+              <w:rPr>
+                <w:noProof/>
+                <w:webHidden/>
+              </w:rPr>
+              <w:t>17</w:t>
+            </w:r>
+            <w:r>
+              <w:rPr>
+                <w:noProof/>
+                <w:webHidden/>
+              </w:rPr>
+              <w:fldChar w:fldCharType="end"/>
+            </w:r>
+          </w:hyperlink>
+        </w:p>
+        <w:p>
+          <w:pPr>
+            <w:pStyle w:val="TOC2"/>
+            <w:tabs>
+              <w:tab w:val="left" w:pos="960"/>
+              <w:tab w:val="right" w:leader="dot" w:pos="9350"/>
+            </w:tabs>
+            <w:rPr>
+              <w:rFonts w:cstheme="minorBidi"/>
+              <w:noProof/>
+              <w:kern w:val="2"/>
+              <w:sz w:val="24"/>
+              <w:szCs w:val="24"/>
+              <w:lang w:val="vi-VN" w:eastAsia="vi-VN"/>
+              <w14:ligatures w14:val="standardContextual"/>
+            </w:rPr>
+          </w:pPr>
+          <w:hyperlink w:anchor="_Toc237935623" w:history="1">
+            <w:r>
+              <w:rPr>
+                <w:rStyle w:val="Hyperlink"/>
+                <w:noProof/>
+              </w:rPr>
+              <w:t>15.2.</w:t>
+            </w:r>
+            <w:r>
+              <w:rPr>
+                <w:rFonts w:cstheme="minorBidi"/>
+                <w:noProof/>
+                <w:kern w:val="2"/>
+                <w:sz w:val="24"/>
+                <w:szCs w:val="24"/>
+                <w:lang w:val="vi-VN" w:eastAsia="vi-VN"/>
+                <w14:ligatures w14:val="standardContextual"/>
+              </w:rPr>
+              <w:tab/>
+            </w:r>
+            <w:r>
+              <w:rPr>
+                <w:rStyle w:val="Hyperlink"/>
+                <w:noProof/>
+              </w:rPr>
+              <w:t>Ràng buộc (Constraints)</w:t>
+            </w:r>
+            <w:r>
+              <w:rPr>
+                <w:noProof/>
+                <w:webHidden/>
+              </w:rPr>
+              <w:tab/>
+            </w:r>
+            <w:r>
+              <w:rPr>
+                <w:noProof/>
+                <w:webHidden/>
+              </w:rPr>
+              <w:fldChar w:fldCharType="begin"/>
+            </w:r>
+            <w:r>
+              <w:rPr>
+                <w:noProof/>
+                <w:webHidden/>
+              </w:rPr>
+              <w:instrText xml:space="preserve"> PAGEREF _Toc237935623 \h </w:instrText>
+            </w:r>
+            <w:r>
+              <w:rPr>
+                <w:noProof/>
+                <w:webHidden/>
+              </w:rPr>
+            </w:r>
+            <w:r>
+              <w:rPr>
+                <w:noProof/>
+                <w:webHidden/>
+              </w:rPr>
+              <w:fldChar w:fldCharType="separate"/>
+            </w:r>
+            <w:r>
+              <w:rPr>
+                <w:noProof/>
+                <w:webHidden/>
+              </w:rPr>
+              <w:t>17</w:t>
+            </w:r>
+            <w:r>
+              <w:rPr>
+                <w:noProof/>
+                <w:webHidden/>
+              </w:rPr>
+              <w:fldChar w:fldCharType="end"/>
+            </w:r>
+          </w:hyperlink>
+        </w:p>
+        <w:p>
+          <w:pPr>
+            <w:pStyle w:val="TOC2"/>
+            <w:tabs>
+              <w:tab w:val="left" w:pos="960"/>
+              <w:tab w:val="right" w:leader="dot" w:pos="9350"/>
+            </w:tabs>
+            <w:rPr>
+              <w:rFonts w:cstheme="minorBidi"/>
+              <w:noProof/>
+              <w:kern w:val="2"/>
+              <w:sz w:val="24"/>
+              <w:szCs w:val="24"/>
+              <w:lang w:val="vi-VN" w:eastAsia="vi-VN"/>
+              <w14:ligatures w14:val="standardContextual"/>
+            </w:rPr>
+          </w:pPr>
+          <w:hyperlink w:anchor="_Toc237935624" w:history="1">
+            <w:r>
+              <w:rPr>
+                <w:rStyle w:val="Hyperlink"/>
+                <w:noProof/>
+              </w:rPr>
+              <w:t>15.3.</w:t>
+            </w:r>
+            <w:r>
+              <w:rPr>
+                <w:rFonts w:cstheme="minorBidi"/>
+                <w:noProof/>
+                <w:kern w:val="2"/>
+                <w:sz w:val="24"/>
+                <w:szCs w:val="24"/>
+                <w:lang w:val="vi-VN" w:eastAsia="vi-VN"/>
+                <w14:ligatures w14:val="standardContextual"/>
+              </w:rPr>
+              <w:tab/>
+            </w:r>
+            <w:r>
+              <w:rPr>
+                <w:rStyle w:val="Hyperlink"/>
+                <w:noProof/>
+              </w:rPr>
+              <w:t>Phụ thuộc (Dependencies)</w:t>
+            </w:r>
+            <w:r>
+              <w:rPr>
+                <w:noProof/>
+                <w:webHidden/>
+              </w:rPr>
+              <w:tab/>
+            </w:r>
+            <w:r>
+              <w:rPr>
+                <w:noProof/>
+                <w:webHidden/>
+              </w:rPr>
+              <w:fldChar w:fldCharType="begin"/>
+            </w:r>
+            <w:r>
+              <w:rPr>
+                <w:noProof/>
+                <w:webHidden/>
+              </w:rPr>
+              <w:instrText xml:space="preserve"> PAGEREF _Toc237935624 \h </w:instrText>
+            </w:r>
+            <w:r>
+              <w:rPr>
+                <w:noProof/>
+                <w:webHidden/>
+              </w:rPr>
+            </w:r>
+            <w:r>
+              <w:rPr>
+                <w:noProof/>
+                <w:webHidden/>
+              </w:rPr>
+              <w:fldChar w:fldCharType="separate"/>
+            </w:r>
+            <w:r>
+              <w:rPr>
+                <w:noProof/>
+                <w:webHidden/>
+              </w:rPr>
+              <w:t>17</w:t>
+            </w:r>
+            <w:r>
+              <w:rPr>
+                <w:noProof/>
+                <w:webHidden/>
+              </w:rPr>
+              <w:fldChar w:fldCharType="end"/>
+            </w:r>
+          </w:hyperlink>
+        </w:p>
+        <w:p>
+          <w:pPr>
+            <w:pStyle w:val="TOC1"/>
+            <w:tabs>
+              <w:tab w:val="left" w:pos="720"/>
+              <w:tab w:val="right" w:leader="dot" w:pos="9350"/>
+            </w:tabs>
+            <w:rPr>
+              <w:rFonts w:cstheme="minorBidi"/>
+              <w:noProof/>
+              <w:kern w:val="2"/>
+              <w:sz w:val="24"/>
+              <w:szCs w:val="24"/>
+              <w:lang w:val="vi-VN" w:eastAsia="vi-VN"/>
+              <w14:ligatures w14:val="standardContextual"/>
+            </w:rPr>
+          </w:pPr>
+          <w:hyperlink w:anchor="_Toc237935625" w:history="1">
+            <w:r>
+              <w:rPr>
+                <w:rStyle w:val="Hyperlink"/>
+                <w:noProof/>
+              </w:rPr>
+              <w:t>16.</w:t>
+            </w:r>
+            <w:r>
+              <w:rPr>
+                <w:rFonts w:cstheme="minorBidi"/>
+                <w:noProof/>
+                <w:kern w:val="2"/>
+                <w:sz w:val="24"/>
+                <w:szCs w:val="24"/>
+                <w:lang w:val="vi-VN" w:eastAsia="vi-VN"/>
+                <w14:ligatures w14:val="standardContextual"/>
+              </w:rPr>
+              <w:tab/>
+            </w:r>
+            <w:r>
+              <w:rPr>
+                <w:rStyle w:val="Hyperlink"/>
+                <w:noProof/>
+              </w:rPr>
+              <w:t>Phụ lục – Thuật ngữ &amp; viết tắt</w:t>
+            </w:r>
+            <w:r>
+              <w:rPr>
+                <w:noProof/>
+                <w:webHidden/>
+              </w:rPr>
+              <w:tab/>
+            </w:r>
+            <w:r>
+              <w:rPr>
+                <w:noProof/>
+                <w:webHidden/>
+              </w:rPr>
+              <w:fldChar w:fldCharType="begin"/>
+            </w:r>
+            <w:r>
+              <w:rPr>
+                <w:noProof/>
+                <w:webHidden/>
+              </w:rPr>
+              <w:instrText xml:space="preserve"> PAGEREF _Toc237935625 \h </w:instrText>
+            </w:r>
+            <w:r>
+              <w:rPr>
+                <w:noProof/>
+                <w:webHidden/>
+              </w:rPr>
+            </w:r>
+            <w:r>
+              <w:rPr>
+                <w:noProof/>
+                <w:webHidden/>
+              </w:rPr>
+              <w:fldChar w:fldCharType="separate"/>
+            </w:r>
+            <w:r>
+              <w:rPr>
+                <w:noProof/>
+                <w:webHidden/>
+              </w:rPr>
+              <w:t>18</w:t>
+            </w:r>
+            <w:r>
+              <w:rPr>
+                <w:noProof/>
+                <w:webHidden/>
+              </w:rPr>
+              <w:fldChar w:fldCharType="end"/>
+            </w:r>
+          </w:hyperlink>
+        </w:p>
+        <w:p>
           <w:r>
             <w:fldChar w:fldCharType="end"/>
           </w:r>
@@ -1509,15 +4270,18 @@
       <w:pPr>
         <w:pStyle w:val="heading10"/>
       </w:pPr>
+      <w:bookmarkStart w:id="6" w:name="_Toc237935602"/>
       <w:r>
         <w:lastRenderedPageBreak/>
         <w:t>Giới thiệu &amp; bối cảnh</w:t>
       </w:r>
+      <w:bookmarkEnd w:id="6"/>
     </w:p>
     <w:p>
       <w:pPr>
         <w:pStyle w:val="heading20"/>
       </w:pPr>
+      <w:bookmarkStart w:id="7" w:name="_Toc237935603"/>
       <w:r>
         <w:t>Bài toán kinh doanh</w:t>
       </w:r>
@@ -1527,6 +4291,7 @@
         </w:rPr>
         <w:t xml:space="preserve">  [BẮT BUỘC]</w:t>
       </w:r>
+      <w:bookmarkEnd w:id="7"/>
     </w:p>
     <w:p>
       <w:pPr>
@@ -1557,6 +4322,7 @@
       <w:pPr>
         <w:pStyle w:val="heading10"/>
       </w:pPr>
+      <w:bookmarkStart w:id="8" w:name="_Toc237935604"/>
       <w:r>
         <w:t>Mục tiêu &amp; giá trị kinh doanh</w:t>
       </w:r>
@@ -1566,6 +4332,7 @@
         </w:rPr>
         <w:t xml:space="preserve">  [BẮT BUỘC]</w:t>
       </w:r>
+      <w:bookmarkEnd w:id="8"/>
     </w:p>
     <w:p>
       <w:pPr>
@@ -1604,12 +4371,6 @@
         <w:gridCol w:w="2806"/>
       </w:tblGrid>
       <w:tr>
-        <w:tblPrEx>
-          <w:tblCellMar>
-            <w:top w:w="0" w:type="dxa"/>
-            <w:bottom w:w="0" w:type="dxa"/>
-          </w:tblCellMar>
-        </w:tblPrEx>
         <w:trPr>
           <w:tblHeader/>
         </w:trPr>
@@ -1699,12 +4460,6 @@
         </w:tc>
       </w:tr>
       <w:tr>
-        <w:tblPrEx>
-          <w:tblCellMar>
-            <w:top w:w="0" w:type="dxa"/>
-            <w:bottom w:w="0" w:type="dxa"/>
-          </w:tblCellMar>
-        </w:tblPrEx>
         <w:tc>
           <w:tcPr>
             <w:tcW w:w="1200" w:type="dxa"/>
@@ -1762,12 +4517,6 @@
         </w:tc>
       </w:tr>
       <w:tr>
-        <w:tblPrEx>
-          <w:tblCellMar>
-            <w:top w:w="0" w:type="dxa"/>
-            <w:bottom w:w="0" w:type="dxa"/>
-          </w:tblCellMar>
-        </w:tblPrEx>
         <w:tc>
           <w:tcPr>
             <w:tcW w:w="1200" w:type="dxa"/>
@@ -1829,9 +4578,11 @@
       <w:pPr>
         <w:pStyle w:val="heading20"/>
       </w:pPr>
+      <w:bookmarkStart w:id="9" w:name="_Toc237935605"/>
       <w:r>
         <w:t>Đối tượng đọc tài liệu</w:t>
       </w:r>
+      <w:bookmarkEnd w:id="9"/>
     </w:p>
     <w:p>
       <w:pPr>
@@ -1853,6 +4604,7 @@
       <w:pPr>
         <w:pStyle w:val="heading10"/>
       </w:pPr>
+      <w:bookmarkStart w:id="10" w:name="_Toc237935606"/>
       <w:r>
         <w:lastRenderedPageBreak/>
         <w:t xml:space="preserve">Phạm vi (Scope) </w:t>
@@ -1865,6 +4617,7 @@
         </w:rPr>
         <w:t>[BẮT BUỘC]</w:t>
       </w:r>
+      <w:bookmarkEnd w:id="10"/>
     </w:p>
     <w:p>
       <w:pPr>
@@ -1884,9 +4637,11 @@
       <w:pPr>
         <w:pStyle w:val="heading20"/>
       </w:pPr>
+      <w:bookmarkStart w:id="11" w:name="_Toc237935607"/>
       <w:r>
         <w:t>Trong phạm vi (In scope)</w:t>
       </w:r>
+      <w:bookmarkEnd w:id="11"/>
     </w:p>
     <w:p>
       <w:pPr>
@@ -1908,9 +4663,11 @@
       <w:pPr>
         <w:pStyle w:val="heading20"/>
       </w:pPr>
+      <w:bookmarkStart w:id="12" w:name="_Toc237935608"/>
       <w:r>
         <w:t>Ngoài phạm vi (Out of scope)</w:t>
       </w:r>
+      <w:bookmarkEnd w:id="12"/>
     </w:p>
     <w:p>
       <w:pPr>
@@ -1932,9 +4689,11 @@
       <w:pPr>
         <w:pStyle w:val="heading20"/>
       </w:pPr>
+      <w:bookmarkStart w:id="13" w:name="_Toc237935609"/>
       <w:r>
         <w:t>Đối tượng / hệ thống liên quan</w:t>
       </w:r>
+      <w:bookmarkEnd w:id="13"/>
     </w:p>
     <w:p>
       <w:pPr>
@@ -1970,6 +4729,7 @@
       <w:pPr>
         <w:pStyle w:val="heading10"/>
       </w:pPr>
+      <w:bookmarkStart w:id="14" w:name="_Toc237935610"/>
       <w:r>
         <w:lastRenderedPageBreak/>
         <w:t xml:space="preserve">Đối tượng tham gia (Actors) </w:t>
@@ -1982,6 +4742,7 @@
         </w:rPr>
         <w:t>[BẮT BUỘC]</w:t>
       </w:r>
+      <w:bookmarkEnd w:id="14"/>
     </w:p>
     <w:p>
       <w:pPr>
@@ -2021,12 +4782,6 @@
         <w:gridCol w:w="2246"/>
       </w:tblGrid>
       <w:tr>
-        <w:tblPrEx>
-          <w:tblCellMar>
-            <w:top w:w="0" w:type="dxa"/>
-            <w:bottom w:w="0" w:type="dxa"/>
-          </w:tblCellMar>
-        </w:tblPrEx>
         <w:trPr>
           <w:tblHeader/>
         </w:trPr>
@@ -2144,12 +4899,6 @@
         </w:tc>
       </w:tr>
       <w:tr>
-        <w:tblPrEx>
-          <w:tblCellMar>
-            <w:top w:w="0" w:type="dxa"/>
-            <w:bottom w:w="0" w:type="dxa"/>
-          </w:tblCellMar>
-        </w:tblPrEx>
         <w:tc>
           <w:tcPr>
             <w:tcW w:w="1400" w:type="dxa"/>
@@ -2223,12 +4972,6 @@
         </w:tc>
       </w:tr>
       <w:tr>
-        <w:tblPrEx>
-          <w:tblCellMar>
-            <w:top w:w="0" w:type="dxa"/>
-            <w:bottom w:w="0" w:type="dxa"/>
-          </w:tblCellMar>
-        </w:tblPrEx>
         <w:tc>
           <w:tcPr>
             <w:tcW w:w="1400" w:type="dxa"/>
@@ -2311,6 +5054,7 @@
       <w:pPr>
         <w:pStyle w:val="heading10"/>
       </w:pPr>
+      <w:bookmarkStart w:id="15" w:name="_Toc237935611"/>
       <w:r>
         <w:lastRenderedPageBreak/>
         <w:t>Quy trình nghiệp vụ (Business Process)</w:t>
@@ -2323,14 +5067,17 @@
         </w:rPr>
         <w:t xml:space="preserve">  [BẮT BUỘC]</w:t>
       </w:r>
+      <w:bookmarkEnd w:id="15"/>
     </w:p>
     <w:p>
       <w:pPr>
         <w:pStyle w:val="heading20"/>
       </w:pPr>
+      <w:bookmarkStart w:id="16" w:name="_Toc237935612"/>
       <w:r>
         <w:t>Quy trình hiện tại (As-Is)</w:t>
       </w:r>
+      <w:bookmarkEnd w:id="16"/>
     </w:p>
     <w:p>
       <w:pPr>
@@ -2361,9 +5108,11 @@
       <w:pPr>
         <w:pStyle w:val="heading20"/>
       </w:pPr>
+      <w:bookmarkStart w:id="17" w:name="_Toc237935613"/>
       <w:r>
         <w:t>Quy trình mục tiêu (To-Be)</w:t>
       </w:r>
+      <w:bookmarkEnd w:id="17"/>
     </w:p>
     <w:p>
       <w:pPr>
@@ -2403,12 +5152,6 @@
         <w:gridCol w:w="2846"/>
       </w:tblGrid>
       <w:tr>
-        <w:tblPrEx>
-          <w:tblCellMar>
-            <w:top w:w="0" w:type="dxa"/>
-            <w:bottom w:w="0" w:type="dxa"/>
-          </w:tblCellMar>
-        </w:tblPrEx>
         <w:trPr>
           <w:tblHeader/>
         </w:trPr>
@@ -2526,12 +5269,6 @@
         </w:tc>
       </w:tr>
       <w:tr>
-        <w:tblPrEx>
-          <w:tblCellMar>
-            <w:top w:w="0" w:type="dxa"/>
-            <w:bottom w:w="0" w:type="dxa"/>
-          </w:tblCellMar>
-        </w:tblPrEx>
         <w:tc>
           <w:tcPr>
             <w:tcW w:w="1200" w:type="dxa"/>
@@ -2605,12 +5342,6 @@
         </w:tc>
       </w:tr>
       <w:tr>
-        <w:tblPrEx>
-          <w:tblCellMar>
-            <w:top w:w="0" w:type="dxa"/>
-            <w:bottom w:w="0" w:type="dxa"/>
-          </w:tblCellMar>
-        </w:tblPrEx>
         <w:tc>
           <w:tcPr>
             <w:tcW w:w="1200" w:type="dxa"/>
@@ -2693,6 +5424,7 @@
       <w:pPr>
         <w:pStyle w:val="heading10"/>
       </w:pPr>
+      <w:bookmarkStart w:id="18" w:name="_Toc237935614"/>
       <w:r>
         <w:lastRenderedPageBreak/>
         <w:t>Yêu cầu nghiệp vụ (Business Requirements)</w:t>
@@ -2705,6 +5437,7 @@
         </w:rPr>
         <w:t xml:space="preserve">  [BẮT BUỘC]</w:t>
       </w:r>
+      <w:bookmarkEnd w:id="18"/>
     </w:p>
     <w:p>
       <w:pPr>
@@ -2744,12 +5477,6 @@
         <w:gridCol w:w="1906"/>
       </w:tblGrid>
       <w:tr>
-        <w:tblPrEx>
-          <w:tblCellMar>
-            <w:top w:w="0" w:type="dxa"/>
-            <w:bottom w:w="0" w:type="dxa"/>
-          </w:tblCellMar>
-        </w:tblPrEx>
         <w:trPr>
           <w:tblHeader/>
         </w:trPr>
@@ -2867,12 +5594,6 @@
         </w:tc>
       </w:tr>
       <w:tr>
-        <w:tblPrEx>
-          <w:tblCellMar>
-            <w:top w:w="0" w:type="dxa"/>
-            <w:bottom w:w="0" w:type="dxa"/>
-          </w:tblCellMar>
-        </w:tblPrEx>
         <w:tc>
           <w:tcPr>
             <w:tcW w:w="1200" w:type="dxa"/>
@@ -2960,12 +5681,6 @@
         </w:tc>
       </w:tr>
       <w:tr>
-        <w:tblPrEx>
-          <w:tblCellMar>
-            <w:top w:w="0" w:type="dxa"/>
-            <w:bottom w:w="0" w:type="dxa"/>
-          </w:tblCellMar>
-        </w:tblPrEx>
         <w:tc>
           <w:tcPr>
             <w:tcW w:w="1200" w:type="dxa"/>
@@ -3046,12 +5761,6 @@
         </w:tc>
       </w:tr>
       <w:tr>
-        <w:tblPrEx>
-          <w:tblCellMar>
-            <w:top w:w="0" w:type="dxa"/>
-            <w:bottom w:w="0" w:type="dxa"/>
-          </w:tblCellMar>
-        </w:tblPrEx>
         <w:tc>
           <w:tcPr>
             <w:tcW w:w="1200" w:type="dxa"/>
@@ -3134,6 +5843,7 @@
       <w:pPr>
         <w:pStyle w:val="heading10"/>
       </w:pPr>
+      <w:bookmarkStart w:id="19" w:name="_Toc237935615"/>
       <w:r>
         <w:lastRenderedPageBreak/>
         <w:t>Quy tắc nghiệp vụ (Business Rules)</w:t>
@@ -3146,6 +5856,7 @@
         </w:rPr>
         <w:t xml:space="preserve"> [BẮT BUỘC]</w:t>
       </w:r>
+      <w:bookmarkEnd w:id="19"/>
     </w:p>
     <w:p>
       <w:pPr>
@@ -3184,12 +5895,6 @@
         <w:gridCol w:w="3006"/>
       </w:tblGrid>
       <w:tr>
-        <w:tblPrEx>
-          <w:tblCellMar>
-            <w:top w:w="0" w:type="dxa"/>
-            <w:bottom w:w="0" w:type="dxa"/>
-          </w:tblCellMar>
-        </w:tblPrEx>
         <w:trPr>
           <w:tblHeader/>
         </w:trPr>
@@ -3279,12 +5984,6 @@
         </w:tc>
       </w:tr>
       <w:tr>
-        <w:tblPrEx>
-          <w:tblCellMar>
-            <w:top w:w="0" w:type="dxa"/>
-            <w:bottom w:w="0" w:type="dxa"/>
-          </w:tblCellMar>
-        </w:tblPrEx>
         <w:tc>
           <w:tcPr>
             <w:tcW w:w="1300" w:type="dxa"/>
@@ -3342,12 +6041,6 @@
         </w:tc>
       </w:tr>
       <w:tr>
-        <w:tblPrEx>
-          <w:tblCellMar>
-            <w:top w:w="0" w:type="dxa"/>
-            <w:bottom w:w="0" w:type="dxa"/>
-          </w:tblCellMar>
-        </w:tblPrEx>
         <w:tc>
           <w:tcPr>
             <w:tcW w:w="1300" w:type="dxa"/>
@@ -3418,6 +6111,7 @@
         <w:lastRenderedPageBreak/>
         <w:t xml:space="preserve"> </w:t>
       </w:r>
+      <w:bookmarkStart w:id="20" w:name="_Toc237935616"/>
       <w:r>
         <w:t>Trường hợp sử dụng (Use Cases)</w:t>
       </w:r>
@@ -3429,6 +6123,7 @@
         </w:rPr>
         <w:t xml:space="preserve"> [KHUYẾN NGHỊ]</w:t>
       </w:r>
+      <w:bookmarkEnd w:id="20"/>
     </w:p>
     <w:p>
       <w:pPr>
@@ -3466,12 +6161,6 @@
         <w:gridCol w:w="6740"/>
       </w:tblGrid>
       <w:tr>
-        <w:tblPrEx>
-          <w:tblCellMar>
-            <w:top w:w="0" w:type="dxa"/>
-            <w:bottom w:w="0" w:type="dxa"/>
-          </w:tblCellMar>
-        </w:tblPrEx>
         <w:trPr>
           <w:tblHeader/>
         </w:trPr>
@@ -3532,12 +6221,6 @@
         </w:tc>
       </w:tr>
       <w:tr>
-        <w:tblPrEx>
-          <w:tblCellMar>
-            <w:top w:w="0" w:type="dxa"/>
-            <w:bottom w:w="0" w:type="dxa"/>
-          </w:tblCellMar>
-        </w:tblPrEx>
         <w:tc>
           <w:tcPr>
             <w:tcW w:w="2600" w:type="dxa"/>
@@ -3588,12 +6271,6 @@
         </w:tc>
       </w:tr>
       <w:tr>
-        <w:tblPrEx>
-          <w:tblCellMar>
-            <w:top w:w="0" w:type="dxa"/>
-            <w:bottom w:w="0" w:type="dxa"/>
-          </w:tblCellMar>
-        </w:tblPrEx>
         <w:tc>
           <w:tcPr>
             <w:tcW w:w="2600" w:type="dxa"/>
@@ -3637,12 +6314,6 @@
         </w:tc>
       </w:tr>
       <w:tr>
-        <w:tblPrEx>
-          <w:tblCellMar>
-            <w:top w:w="0" w:type="dxa"/>
-            <w:bottom w:w="0" w:type="dxa"/>
-          </w:tblCellMar>
-        </w:tblPrEx>
         <w:tc>
           <w:tcPr>
             <w:tcW w:w="2600" w:type="dxa"/>
@@ -3693,12 +6364,6 @@
         </w:tc>
       </w:tr>
       <w:tr>
-        <w:tblPrEx>
-          <w:tblCellMar>
-            <w:top w:w="0" w:type="dxa"/>
-            <w:bottom w:w="0" w:type="dxa"/>
-          </w:tblCellMar>
-        </w:tblPrEx>
         <w:tc>
           <w:tcPr>
             <w:tcW w:w="2600" w:type="dxa"/>
@@ -3742,12 +6407,6 @@
         </w:tc>
       </w:tr>
       <w:tr>
-        <w:tblPrEx>
-          <w:tblCellMar>
-            <w:top w:w="0" w:type="dxa"/>
-            <w:bottom w:w="0" w:type="dxa"/>
-          </w:tblCellMar>
-        </w:tblPrEx>
         <w:tc>
           <w:tcPr>
             <w:tcW w:w="2600" w:type="dxa"/>
@@ -3798,12 +6457,6 @@
         </w:tc>
       </w:tr>
       <w:tr>
-        <w:tblPrEx>
-          <w:tblCellMar>
-            <w:top w:w="0" w:type="dxa"/>
-            <w:bottom w:w="0" w:type="dxa"/>
-          </w:tblCellMar>
-        </w:tblPrEx>
         <w:tc>
           <w:tcPr>
             <w:tcW w:w="2600" w:type="dxa"/>
@@ -3847,12 +6500,6 @@
         </w:tc>
       </w:tr>
       <w:tr>
-        <w:tblPrEx>
-          <w:tblCellMar>
-            <w:top w:w="0" w:type="dxa"/>
-            <w:bottom w:w="0" w:type="dxa"/>
-          </w:tblCellMar>
-        </w:tblPrEx>
         <w:tc>
           <w:tcPr>
             <w:tcW w:w="2600" w:type="dxa"/>
@@ -3916,6 +6563,7 @@
         <w:lastRenderedPageBreak/>
         <w:t xml:space="preserve"> </w:t>
       </w:r>
+      <w:bookmarkStart w:id="21" w:name="_Toc237935617"/>
       <w:r>
         <w:t>Điều kiện đầu vào / đầu ra</w:t>
       </w:r>
@@ -3927,6 +6575,7 @@
         </w:rPr>
         <w:t xml:space="preserve">  [KHUYẾN NGHỊ]</w:t>
       </w:r>
+      <w:bookmarkEnd w:id="21"/>
     </w:p>
     <w:p>
       <w:pPr>
@@ -3964,12 +6613,6 @@
         <w:gridCol w:w="4673"/>
       </w:tblGrid>
       <w:tr>
-        <w:tblPrEx>
-          <w:tblCellMar>
-            <w:top w:w="0" w:type="dxa"/>
-            <w:bottom w:w="0" w:type="dxa"/>
-          </w:tblCellMar>
-        </w:tblPrEx>
         <w:trPr>
           <w:tblHeader/>
         </w:trPr>
@@ -4031,12 +6674,6 @@
         </w:tc>
       </w:tr>
       <w:tr>
-        <w:tblPrEx>
-          <w:tblCellMar>
-            <w:top w:w="0" w:type="dxa"/>
-            <w:bottom w:w="0" w:type="dxa"/>
-          </w:tblCellMar>
-        </w:tblPrEx>
         <w:tc>
           <w:tcPr>
             <w:tcW w:w="4673" w:type="dxa"/>
@@ -4084,6 +6721,7 @@
         <w:lastRenderedPageBreak/>
         <w:t xml:space="preserve"> </w:t>
       </w:r>
+      <w:bookmarkStart w:id="22" w:name="_Toc237935618"/>
       <w:r>
         <w:t>Trường hợp ngoại lệ nghiệp vụ</w:t>
       </w:r>
@@ -4095,6 +6733,7 @@
         </w:rPr>
         <w:t xml:space="preserve">  [KHUYẾN NGHỊ]</w:t>
       </w:r>
+      <w:bookmarkEnd w:id="22"/>
     </w:p>
     <w:p>
       <w:pPr>
@@ -4133,12 +6772,6 @@
         <w:gridCol w:w="4006"/>
       </w:tblGrid>
       <w:tr>
-        <w:tblPrEx>
-          <w:tblCellMar>
-            <w:top w:w="0" w:type="dxa"/>
-            <w:bottom w:w="0" w:type="dxa"/>
-          </w:tblCellMar>
-        </w:tblPrEx>
         <w:trPr>
           <w:tblHeader/>
         </w:trPr>
@@ -4228,12 +6861,6 @@
         </w:tc>
       </w:tr>
       <w:tr>
-        <w:tblPrEx>
-          <w:tblCellMar>
-            <w:top w:w="0" w:type="dxa"/>
-            <w:bottom w:w="0" w:type="dxa"/>
-          </w:tblCellMar>
-        </w:tblPrEx>
         <w:tc>
           <w:tcPr>
             <w:tcW w:w="1300" w:type="dxa"/>
@@ -4291,12 +6918,6 @@
         </w:tc>
       </w:tr>
       <w:tr>
-        <w:tblPrEx>
-          <w:tblCellMar>
-            <w:top w:w="0" w:type="dxa"/>
-            <w:bottom w:w="0" w:type="dxa"/>
-          </w:tblCellMar>
-        </w:tblPrEx>
         <w:tc>
           <w:tcPr>
             <w:tcW w:w="1300" w:type="dxa"/>
@@ -4367,6 +6988,7 @@
         <w:lastRenderedPageBreak/>
         <w:t xml:space="preserve"> </w:t>
       </w:r>
+      <w:bookmarkStart w:id="23" w:name="_Toc237935619"/>
       <w:r>
         <w:t>Tiêu chí nghiệm thu nghiệp vụ</w:t>
       </w:r>
@@ -4378,6 +7000,7 @@
         </w:rPr>
         <w:t xml:space="preserve">  [BẮT BUỘC]</w:t>
       </w:r>
+      <w:bookmarkEnd w:id="23"/>
     </w:p>
     <w:p>
       <w:pPr>
@@ -4416,12 +7039,6 @@
         <w:gridCol w:w="2806"/>
       </w:tblGrid>
       <w:tr>
-        <w:tblPrEx>
-          <w:tblCellMar>
-            <w:top w:w="0" w:type="dxa"/>
-            <w:bottom w:w="0" w:type="dxa"/>
-          </w:tblCellMar>
-        </w:tblPrEx>
         <w:trPr>
           <w:tblHeader/>
         </w:trPr>
@@ -4511,12 +7128,6 @@
         </w:tc>
       </w:tr>
       <w:tr>
-        <w:tblPrEx>
-          <w:tblCellMar>
-            <w:top w:w="0" w:type="dxa"/>
-            <w:bottom w:w="0" w:type="dxa"/>
-          </w:tblCellMar>
-        </w:tblPrEx>
         <w:tc>
           <w:tcPr>
             <w:tcW w:w="1300" w:type="dxa"/>
@@ -4581,12 +7192,6 @@
         </w:tc>
       </w:tr>
       <w:tr>
-        <w:tblPrEx>
-          <w:tblCellMar>
-            <w:top w:w="0" w:type="dxa"/>
-            <w:bottom w:w="0" w:type="dxa"/>
-          </w:tblCellMar>
-        </w:tblPrEx>
         <w:tc>
           <w:tcPr>
             <w:tcW w:w="1300" w:type="dxa"/>
@@ -4657,9 +7262,11 @@
         <w:lastRenderedPageBreak/>
         <w:t xml:space="preserve"> </w:t>
       </w:r>
+      <w:bookmarkStart w:id="24" w:name="_Toc237935620"/>
       <w:r>
         <w:t>Yêu cầu phi chức năng (mức mục tiêu)</w:t>
       </w:r>
+      <w:bookmarkEnd w:id="24"/>
     </w:p>
     <w:p>
       <w:pPr>
@@ -4697,12 +7304,6 @@
         <w:gridCol w:w="6546"/>
       </w:tblGrid>
       <w:tr>
-        <w:tblPrEx>
-          <w:tblCellMar>
-            <w:top w:w="0" w:type="dxa"/>
-            <w:bottom w:w="0" w:type="dxa"/>
-          </w:tblCellMar>
-        </w:tblPrEx>
         <w:trPr>
           <w:tblHeader/>
         </w:trPr>
@@ -4764,12 +7365,6 @@
         </w:tc>
       </w:tr>
       <w:tr>
-        <w:tblPrEx>
-          <w:tblCellMar>
-            <w:top w:w="0" w:type="dxa"/>
-            <w:bottom w:w="0" w:type="dxa"/>
-          </w:tblCellMar>
-        </w:tblPrEx>
         <w:tc>
           <w:tcPr>
             <w:tcW w:w="2800" w:type="dxa"/>
@@ -4813,12 +7408,6 @@
         </w:tc>
       </w:tr>
       <w:tr>
-        <w:tblPrEx>
-          <w:tblCellMar>
-            <w:top w:w="0" w:type="dxa"/>
-            <w:bottom w:w="0" w:type="dxa"/>
-          </w:tblCellMar>
-        </w:tblPrEx>
         <w:tc>
           <w:tcPr>
             <w:tcW w:w="2800" w:type="dxa"/>
@@ -4862,12 +7451,6 @@
         </w:tc>
       </w:tr>
       <w:tr>
-        <w:tblPrEx>
-          <w:tblCellMar>
-            <w:top w:w="0" w:type="dxa"/>
-            <w:bottom w:w="0" w:type="dxa"/>
-          </w:tblCellMar>
-        </w:tblPrEx>
         <w:tc>
           <w:tcPr>
             <w:tcW w:w="2800" w:type="dxa"/>
@@ -4911,12 +7494,6 @@
         </w:tc>
       </w:tr>
       <w:tr>
-        <w:tblPrEx>
-          <w:tblCellMar>
-            <w:top w:w="0" w:type="dxa"/>
-            <w:bottom w:w="0" w:type="dxa"/>
-          </w:tblCellMar>
-        </w:tblPrEx>
         <w:tc>
           <w:tcPr>
             <w:tcW w:w="2800" w:type="dxa"/>
@@ -4960,12 +7537,6 @@
         </w:tc>
       </w:tr>
       <w:tr>
-        <w:tblPrEx>
-          <w:tblCellMar>
-            <w:top w:w="0" w:type="dxa"/>
-            <w:bottom w:w="0" w:type="dxa"/>
-          </w:tblCellMar>
-        </w:tblPrEx>
         <w:tc>
           <w:tcPr>
             <w:tcW w:w="2800" w:type="dxa"/>
@@ -5021,17 +7592,21 @@
         <w:lastRenderedPageBreak/>
         <w:t xml:space="preserve"> </w:t>
       </w:r>
+      <w:bookmarkStart w:id="25" w:name="_Toc237935621"/>
       <w:r>
         <w:t>Giả định, ràng buộc &amp; phụ thuộc</w:t>
       </w:r>
+      <w:bookmarkEnd w:id="25"/>
     </w:p>
     <w:p>
       <w:pPr>
         <w:pStyle w:val="heading20"/>
       </w:pPr>
+      <w:bookmarkStart w:id="26" w:name="_Toc237935622"/>
       <w:r>
         <w:t>Giả định (Assumptions)</w:t>
       </w:r>
+      <w:bookmarkEnd w:id="26"/>
     </w:p>
     <w:p>
       <w:pPr>
@@ -5053,9 +7628,11 @@
       <w:pPr>
         <w:pStyle w:val="heading20"/>
       </w:pPr>
+      <w:bookmarkStart w:id="27" w:name="_Toc237935623"/>
       <w:r>
         <w:t>Ràng buộc (Constraints)</w:t>
       </w:r>
+      <w:bookmarkEnd w:id="27"/>
     </w:p>
     <w:p>
       <w:pPr>
@@ -5077,9 +7654,11 @@
       <w:pPr>
         <w:pStyle w:val="heading20"/>
       </w:pPr>
+      <w:bookmarkStart w:id="28" w:name="_Toc237935624"/>
       <w:r>
         <w:t>Phụ thuộc (Dependencies)</w:t>
       </w:r>
+      <w:bookmarkEnd w:id="28"/>
     </w:p>
     <w:p>
       <w:pPr>
@@ -5110,9 +7689,11 @@
         <w:lastRenderedPageBreak/>
         <w:t xml:space="preserve"> </w:t>
       </w:r>
+      <w:bookmarkStart w:id="29" w:name="_Toc237935625"/>
       <w:r>
         <w:t>Phụ lục – Thuật ngữ &amp; viết tắt</w:t>
       </w:r>
+      <w:bookmarkEnd w:id="29"/>
     </w:p>
     <w:tbl>
       <w:tblPr>
@@ -5136,12 +7717,6 @@
         <w:gridCol w:w="6746"/>
       </w:tblGrid>
       <w:tr>
-        <w:tblPrEx>
-          <w:tblCellMar>
-            <w:top w:w="0" w:type="dxa"/>
-            <w:bottom w:w="0" w:type="dxa"/>
-          </w:tblCellMar>
-        </w:tblPrEx>
         <w:trPr>
           <w:tblHeader/>
         </w:trPr>
@@ -5203,12 +7778,6 @@
         </w:tc>
       </w:tr>
       <w:tr>
-        <w:tblPrEx>
-          <w:tblCellMar>
-            <w:top w:w="0" w:type="dxa"/>
-            <w:bottom w:w="0" w:type="dxa"/>
-          </w:tblCellMar>
-        </w:tblPrEx>
         <w:tc>
           <w:tcPr>
             <w:tcW w:w="2600" w:type="dxa"/>
@@ -5258,12 +7827,6 @@
         </w:tc>
       </w:tr>
       <w:tr>
-        <w:tblPrEx>
-          <w:tblCellMar>
-            <w:top w:w="0" w:type="dxa"/>
-            <w:bottom w:w="0" w:type="dxa"/>
-          </w:tblCellMar>
-        </w:tblPrEx>
         <w:tc>
           <w:tcPr>
             <w:tcW w:w="2600" w:type="dxa"/>
@@ -5313,12 +7876,6 @@
         </w:tc>
       </w:tr>
       <w:tr>
-        <w:tblPrEx>
-          <w:tblCellMar>
-            <w:top w:w="0" w:type="dxa"/>
-            <w:bottom w:w="0" w:type="dxa"/>
-          </w:tblCellMar>
-        </w:tblPrEx>
         <w:tc>
           <w:tcPr>
             <w:tcW w:w="2600" w:type="dxa"/>
@@ -5355,8 +7912,8 @@
     </w:tbl>
     <w:p/>
     <w:sectPr>
-      <w:headerReference w:type="default" r:id="rId7"/>
-      <w:footerReference w:type="default" r:id="rId8"/>
+      <w:headerReference w:type="default" r:id="rId8"/>
+      <w:footerReference w:type="default" r:id="rId9"/>
       <w:pgSz w:w="12240" w:h="15840"/>
       <w:pgMar w:top="1440" w:right="1440" w:bottom="1440" w:left="1440" w:header="708" w:footer="708" w:gutter="0"/>
       <w:cols w:space="720"/>
@@ -7184,6 +9741,85 @@
       <w:lang w:val="en-US"/>
     </w:rPr>
   </w:style>
+  <w:style w:type="paragraph" w:styleId="TOCHeading">
+    <w:name w:val="TOC Heading"/>
+    <w:basedOn w:val="Heading1"/>
+    <w:next w:val="Normal"/>
+    <w:uiPriority w:val="39"/>
+    <w:unhideWhenUsed/>
+    <w:qFormat/>
+    <w:rsid w:val="00FE61B7"/>
+    <w:pPr>
+      <w:keepNext/>
+      <w:keepLines/>
+      <w:spacing w:before="240" w:line="259" w:lineRule="auto"/>
+      <w:outlineLvl w:val="9"/>
+    </w:pPr>
+    <w:rPr>
+      <w:rFonts w:asciiTheme="majorHAnsi" w:eastAsiaTheme="majorEastAsia" w:hAnsiTheme="majorHAnsi" w:cstheme="majorBidi"/>
+      <w:color w:val="0F4761" w:themeColor="accent1" w:themeShade="BF"/>
+      <w:lang w:val="en-US" w:eastAsia="en-US"/>
+    </w:rPr>
+  </w:style>
+  <w:style w:type="paragraph" w:styleId="TOC2">
+    <w:name w:val="toc 2"/>
+    <w:basedOn w:val="Normal"/>
+    <w:next w:val="Normal"/>
+    <w:autoRedefine/>
+    <w:uiPriority w:val="39"/>
+    <w:unhideWhenUsed/>
+    <w:rsid w:val="00FE61B7"/>
+    <w:pPr>
+      <w:spacing w:after="100" w:line="259" w:lineRule="auto"/>
+      <w:ind w:left="220"/>
+    </w:pPr>
+    <w:rPr>
+      <w:rFonts w:asciiTheme="minorHAnsi" w:eastAsiaTheme="minorEastAsia" w:hAnsiTheme="minorHAnsi"/>
+      <w:color w:val="auto"/>
+      <w:sz w:val="22"/>
+      <w:szCs w:val="22"/>
+      <w:lang w:val="en-US" w:eastAsia="en-US"/>
+    </w:rPr>
+  </w:style>
+  <w:style w:type="paragraph" w:styleId="TOC1">
+    <w:name w:val="toc 1"/>
+    <w:basedOn w:val="Normal"/>
+    <w:next w:val="Normal"/>
+    <w:autoRedefine/>
+    <w:uiPriority w:val="39"/>
+    <w:unhideWhenUsed/>
+    <w:rsid w:val="00FE61B7"/>
+    <w:pPr>
+      <w:spacing w:after="100" w:line="259" w:lineRule="auto"/>
+    </w:pPr>
+    <w:rPr>
+      <w:rFonts w:asciiTheme="minorHAnsi" w:eastAsiaTheme="minorEastAsia" w:hAnsiTheme="minorHAnsi"/>
+      <w:color w:val="auto"/>
+      <w:sz w:val="22"/>
+      <w:szCs w:val="22"/>
+      <w:lang w:val="en-US" w:eastAsia="en-US"/>
+    </w:rPr>
+  </w:style>
+  <w:style w:type="paragraph" w:styleId="TOC3">
+    <w:name w:val="toc 3"/>
+    <w:basedOn w:val="Normal"/>
+    <w:next w:val="Normal"/>
+    <w:autoRedefine/>
+    <w:uiPriority w:val="39"/>
+    <w:unhideWhenUsed/>
+    <w:rsid w:val="00FE61B7"/>
+    <w:pPr>
+      <w:spacing w:after="100" w:line="259" w:lineRule="auto"/>
+      <w:ind w:left="440"/>
+    </w:pPr>
+    <w:rPr>
+      <w:rFonts w:asciiTheme="minorHAnsi" w:eastAsiaTheme="minorEastAsia" w:hAnsiTheme="minorHAnsi"/>
+      <w:color w:val="auto"/>
+      <w:sz w:val="22"/>
+      <w:szCs w:val="22"/>
+      <w:lang w:val="en-US" w:eastAsia="en-US"/>
+    </w:rPr>
+  </w:style>
 </w:styles>
 </file>
 
@@ -7500,4 +10136,16 @@
     </a:ext>
   </a:extLst>
 </a:theme>
+</file>
+
+<file path=customXml/item1.xml><?xml version="1.0" encoding="utf-8"?>
+<b:Sources xmlns:b="http://schemas.openxmlformats.org/officeDocument/2006/bibliography" xmlns="http://schemas.openxmlformats.org/officeDocument/2006/bibliography" SelectedStyle="\APASixthEditionOfficeOnline.xsl" StyleName="APA" Version="6"/>
+</file>
+
+<file path=customXml/itemProps1.xml><?xml version="1.0" encoding="utf-8"?>
+<ds:datastoreItem xmlns:ds="http://schemas.openxmlformats.org/officeDocument/2006/customXml" ds:itemID="{30E5A5FB-AD4B-4732-ABDD-5C0EBE4A3F31}">
+  <ds:schemaRefs>
+    <ds:schemaRef ds:uri="http://schemas.openxmlformats.org/officeDocument/2006/bibliography"/>
+  </ds:schemaRefs>
+</ds:datastoreItem>
 </file>
</xml_diff>